<commit_message>
Sincronizar Anexo B y Anexo F de la v13 con los archivos reales: agregar la vista alerts_by_rule al esquema SQL reproducido en el Anexo B (creada para N-06 pero nunca propagada al anexo) y restituir en el Anexo F los tres comentarios de credencial de laboratorio y el bloque sobre la deprecacion de N8N_BASIC_AUTH_* presentes en docker-compose.yml. Verificar linea por linea los siete anexos tecnicos contra sus archivos fuente (Anexo C, G, H y J sin discrepancias). Actualizar la devolucion de quinta instancia con estos dos hallazgos, cerrados en la misma entrega.
Co-Authored-By: Claude Sonnet 5 <noreply@anthropic.com>
</commit_message>
<xml_diff>
--- a/Tesis_SIEM_v13.docx
+++ b/Tesis_SIEM_v13.docx
@@ -3825,7 +3825,7 @@
         <w:rPr>
           <w:noProof/>
         </w:rPr>
-        <w:t>62</w:t>
+        <w:t>63</w:t>
       </w:r>
       <w:r>
         <w:fldChar w:fldCharType="end"/>
@@ -18481,6 +18481,57 @@
     <w:p/>
     <w:p>
       <w:r>
+        <w:t>-- Vista para distribucion de alertas por regla de deteccion (cobertura del catalogo)</w:t>
+      </w:r>
+    </w:p>
+    <w:p>
+      <w:r>
+        <w:t>CREATE OR REPLACE VIEW alerts_by_rule AS</w:t>
+      </w:r>
+    </w:p>
+    <w:p>
+      <w:r>
+        <w:t>SELECT</w:t>
+      </w:r>
+    </w:p>
+    <w:p>
+      <w:r>
+        <w:t xml:space="preserve">    rule_id,</w:t>
+      </w:r>
+    </w:p>
+    <w:p>
+      <w:r>
+        <w:t xml:space="preserve">    COUNT(*) AS alert_count,</w:t>
+      </w:r>
+    </w:p>
+    <w:p>
+      <w:r>
+        <w:t xml:space="preserve">    MIN(ts) AS primera_vez,</w:t>
+      </w:r>
+    </w:p>
+    <w:p>
+      <w:r>
+        <w:t xml:space="preserve">    MAX(ts) AS ultima_vez</w:t>
+      </w:r>
+    </w:p>
+    <w:p>
+      <w:r>
+        <w:t>FROM alerts</w:t>
+      </w:r>
+    </w:p>
+    <w:p>
+      <w:r>
+        <w:t>GROUP BY rule_id</w:t>
+      </w:r>
+    </w:p>
+    <w:p>
+      <w:r>
+        <w:t>ORDER BY alert_count DESC;</w:t>
+      </w:r>
+    </w:p>
+    <w:p/>
+    <w:p>
+      <w:r>
         <w:rPr>
           <w:rFonts w:ascii="Consolas" w:eastAsia="Consolas" w:hAnsi="Consolas" w:cs="Consolas"/>
           <w:sz w:val="18"/>
@@ -18648,6 +18699,7 @@
           <w:sz w:val="18"/>
           <w:szCs w:val="18"/>
         </w:rPr>
+        <w:lastRenderedPageBreak/>
         <w:t xml:space="preserve">    -- Distribución de outcomes</w:t>
       </w:r>
     </w:p>
@@ -18769,228 +18821,481 @@
           <w:sz w:val="18"/>
           <w:szCs w:val="18"/>
         </w:rPr>
+        <w:t>SELECT</w:t>
+      </w:r>
+    </w:p>
+    <w:p>
+      <w:r>
+        <w:rPr>
+          <w:rFonts w:ascii="Consolas" w:eastAsia="Consolas" w:hAnsi="Consolas" w:cs="Consolas"/>
+          <w:sz w:val="18"/>
+          <w:szCs w:val="18"/>
+        </w:rPr>
+        <w:t xml:space="preserve">    COUNT(DISTINCT p.alert_id)                                                        AS automated_alerts,</w:t>
+      </w:r>
+    </w:p>
+    <w:p>
+      <w:r>
+        <w:rPr>
+          <w:rFonts w:ascii="Consolas" w:eastAsia="Consolas" w:hAnsi="Consolas" w:cs="Consolas"/>
+          <w:sz w:val="18"/>
+          <w:szCs w:val="18"/>
+        </w:rPr>
+        <w:t xml:space="preserve">    COUNT(DISTINCT a.id)                                                              AS total_alerts,</w:t>
+      </w:r>
+    </w:p>
+    <w:p>
+      <w:r>
+        <w:rPr>
+          <w:rFonts w:ascii="Consolas" w:eastAsia="Consolas" w:hAnsi="Consolas" w:cs="Consolas"/>
+          <w:sz w:val="18"/>
+          <w:szCs w:val="18"/>
+        </w:rPr>
+        <w:t xml:space="preserve">    ROUND(COUNT(DISTINCT p.alert_id)::numeric</w:t>
+      </w:r>
+    </w:p>
+    <w:p>
+      <w:r>
+        <w:rPr>
+          <w:rFonts w:ascii="Consolas" w:eastAsia="Consolas" w:hAnsi="Consolas" w:cs="Consolas"/>
+          <w:sz w:val="18"/>
+          <w:szCs w:val="18"/>
+        </w:rPr>
+        <w:t xml:space="preserve">          / NULLIF(COUNT(DISTINCT a.id), 0) * 100, 2)                                AS automation_percentage,</w:t>
+      </w:r>
+    </w:p>
+    <w:p>
+      <w:r>
+        <w:rPr>
+          <w:rFonts w:ascii="Consolas" w:eastAsia="Consolas" w:hAnsi="Consolas" w:cs="Consolas"/>
+          <w:sz w:val="18"/>
+          <w:szCs w:val="18"/>
+        </w:rPr>
+        <w:t xml:space="preserve">    COUNT(*) FILTER (WHERE p.outcome IN (</w:t>
+      </w:r>
+    </w:p>
+    <w:p>
+      <w:r>
+        <w:rPr>
+          <w:rFonts w:ascii="Consolas" w:eastAsia="Consolas" w:hAnsi="Consolas" w:cs="Consolas"/>
+          <w:sz w:val="18"/>
+          <w:szCs w:val="18"/>
+        </w:rPr>
+        <w:t xml:space="preserve">        'success', 'incident_created', 'incident_reused', 'blocked', 'partial_success', 'logged_low'</w:t>
+      </w:r>
+    </w:p>
+    <w:p>
+      <w:r>
+        <w:rPr>
+          <w:rFonts w:ascii="Consolas" w:eastAsia="Consolas" w:hAnsi="Consolas" w:cs="Consolas"/>
+          <w:sz w:val="18"/>
+          <w:szCs w:val="18"/>
+        </w:rPr>
+        <w:t xml:space="preserve">    ))                                                                                AS successful_runs,</w:t>
+      </w:r>
+    </w:p>
+    <w:p>
+      <w:r>
+        <w:rPr>
+          <w:rFonts w:ascii="Consolas" w:eastAsia="Consolas" w:hAnsi="Consolas" w:cs="Consolas"/>
+          <w:sz w:val="18"/>
+          <w:szCs w:val="18"/>
+        </w:rPr>
+        <w:t xml:space="preserve">    COUNT(p.id)                                                                       AS total_runs,</w:t>
+      </w:r>
+    </w:p>
+    <w:p>
+      <w:r>
+        <w:rPr>
+          <w:rFonts w:ascii="Consolas" w:eastAsia="Consolas" w:hAnsi="Consolas" w:cs="Consolas"/>
+          <w:sz w:val="18"/>
+          <w:szCs w:val="18"/>
+        </w:rPr>
+        <w:t xml:space="preserve">    ROUND(COUNT(*) FILTER (WHERE p.outcome IN (</w:t>
+      </w:r>
+    </w:p>
+    <w:p>
+      <w:r>
+        <w:rPr>
+          <w:rFonts w:ascii="Consolas" w:eastAsia="Consolas" w:hAnsi="Consolas" w:cs="Consolas"/>
+          <w:sz w:val="18"/>
+          <w:szCs w:val="18"/>
+        </w:rPr>
+        <w:t xml:space="preserve">        'success', 'incident_created', 'incident_reused', 'blocked', 'partial_success', 'logged_low'</w:t>
+      </w:r>
+    </w:p>
+    <w:p>
+      <w:r>
+        <w:rPr>
+          <w:rFonts w:ascii="Consolas" w:eastAsia="Consolas" w:hAnsi="Consolas" w:cs="Consolas"/>
+          <w:sz w:val="18"/>
+          <w:szCs w:val="18"/>
+        </w:rPr>
+        <w:t xml:space="preserve">    ))::numeric / NULLIF(COUNT(p.id), 0) * 100, 2)                                   AS success_rate,</w:t>
+      </w:r>
+    </w:p>
+    <w:p>
+      <w:r>
+        <w:rPr>
+          <w:rFonts w:ascii="Consolas" w:eastAsia="Consolas" w:hAnsi="Consolas" w:cs="Consolas"/>
+          <w:sz w:val="18"/>
+          <w:szCs w:val="18"/>
+        </w:rPr>
+        <w:t xml:space="preserve">    COUNT(*) FILTER (WHERE p.outcome = 'success')           AS outcome_success,</w:t>
+      </w:r>
+    </w:p>
+    <w:p>
+      <w:r>
+        <w:rPr>
+          <w:rFonts w:ascii="Consolas" w:eastAsia="Consolas" w:hAnsi="Consolas" w:cs="Consolas"/>
+          <w:sz w:val="18"/>
+          <w:szCs w:val="18"/>
+        </w:rPr>
+        <w:t xml:space="preserve">    COUNT(*) FILTER (WHERE p.outcome = 'incident_created')  AS outcome_incident_created,</w:t>
+      </w:r>
+    </w:p>
+    <w:p>
+      <w:r>
+        <w:rPr>
+          <w:rFonts w:ascii="Consolas" w:eastAsia="Consolas" w:hAnsi="Consolas" w:cs="Consolas"/>
+          <w:sz w:val="18"/>
+          <w:szCs w:val="18"/>
+        </w:rPr>
+        <w:t xml:space="preserve">    COUNT(*) FILTER (WHERE p.outcome = 'incident_reused')   AS outcome_incident_reused,</w:t>
+      </w:r>
+    </w:p>
+    <w:p>
+      <w:r>
+        <w:rPr>
+          <w:rFonts w:ascii="Consolas" w:eastAsia="Consolas" w:hAnsi="Consolas" w:cs="Consolas"/>
+          <w:sz w:val="18"/>
+          <w:szCs w:val="18"/>
+        </w:rPr>
+        <w:t xml:space="preserve">    COUNT(*) FILTER (WHERE p.outcome = 'blocked')           AS outcome_blocked,</w:t>
+      </w:r>
+    </w:p>
+    <w:p>
+      <w:r>
+        <w:rPr>
+          <w:rFonts w:ascii="Consolas" w:eastAsia="Consolas" w:hAnsi="Consolas" w:cs="Consolas"/>
+          <w:sz w:val="18"/>
+          <w:szCs w:val="18"/>
+        </w:rPr>
+        <w:t xml:space="preserve">    COUNT(*) FILTER (WHERE p.outcome = 'partial_success')   AS outcome_partial,</w:t>
+      </w:r>
+    </w:p>
+    <w:p>
+      <w:r>
+        <w:rPr>
+          <w:rFonts w:ascii="Consolas" w:eastAsia="Consolas" w:hAnsi="Consolas" w:cs="Consolas"/>
+          <w:sz w:val="18"/>
+          <w:szCs w:val="18"/>
+        </w:rPr>
+        <w:t xml:space="preserve">    COUNT(*) FILTER (WHERE p.outcome = 'logged_low')        AS outcome_logged_low,</w:t>
+      </w:r>
+    </w:p>
+    <w:p>
+      <w:r>
+        <w:rPr>
+          <w:rFonts w:ascii="Consolas" w:eastAsia="Consolas" w:hAnsi="Consolas" w:cs="Consolas"/>
+          <w:sz w:val="18"/>
+          <w:szCs w:val="18"/>
+        </w:rPr>
+        <w:t xml:space="preserve">    COUNT(*) FILTER (WHERE p.outcome = 'failed')            AS outcome_failed</w:t>
+      </w:r>
+    </w:p>
+    <w:p>
+      <w:r>
+        <w:rPr>
+          <w:rFonts w:ascii="Consolas" w:eastAsia="Consolas" w:hAnsi="Consolas" w:cs="Consolas"/>
+          <w:sz w:val="18"/>
+          <w:szCs w:val="18"/>
+        </w:rPr>
+        <w:t>FROM alerts a</w:t>
+      </w:r>
+    </w:p>
+    <w:p>
+      <w:r>
+        <w:rPr>
+          <w:rFonts w:ascii="Consolas" w:eastAsia="Consolas" w:hAnsi="Consolas" w:cs="Consolas"/>
+          <w:sz w:val="18"/>
+          <w:szCs w:val="18"/>
+        </w:rPr>
+        <w:t>LEFT JOIN playbook_runs p ON p.alert_id = a.id</w:t>
+      </w:r>
+    </w:p>
+    <w:p>
+      <w:r>
+        <w:rPr>
+          <w:rFonts w:ascii="Consolas" w:eastAsia="Consolas" w:hAnsi="Consolas" w:cs="Consolas"/>
+          <w:sz w:val="18"/>
+          <w:szCs w:val="18"/>
+        </w:rPr>
+        <w:t>WHERE a.rule_id NOT IN ('test_fix', 'test_playbook', 'test_mejorado', 'test_telegram')</w:t>
+      </w:r>
+    </w:p>
+    <w:p>
+      <w:r>
+        <w:rPr>
+          <w:rFonts w:ascii="Consolas" w:eastAsia="Consolas" w:hAnsi="Consolas" w:cs="Consolas"/>
+          <w:sz w:val="18"/>
+          <w:szCs w:val="18"/>
+        </w:rPr>
+        <w:t xml:space="preserve">  AND a.rule_id NOT LIKE 'test%';</w:t>
+      </w:r>
+    </w:p>
+    <w:p/>
+    <w:p>
+      <w:r>
+        <w:rPr>
+          <w:rFonts w:ascii="Consolas" w:eastAsia="Consolas" w:hAnsi="Consolas" w:cs="Consolas"/>
+          <w:sz w:val="18"/>
+          <w:szCs w:val="18"/>
+        </w:rPr>
+        <w:t>-- Vista para top IPs sospechosas</w:t>
+      </w:r>
+    </w:p>
+    <w:p>
+      <w:r>
+        <w:rPr>
+          <w:rFonts w:ascii="Consolas" w:eastAsia="Consolas" w:hAnsi="Consolas" w:cs="Consolas"/>
+          <w:sz w:val="18"/>
+          <w:szCs w:val="18"/>
+        </w:rPr>
+        <w:t>CREATE OR REPLACE VIEW top_suspicious_ips AS</w:t>
+      </w:r>
+    </w:p>
+    <w:p>
+      <w:r>
+        <w:rPr>
+          <w:rFonts w:ascii="Consolas" w:eastAsia="Consolas" w:hAnsi="Consolas" w:cs="Consolas"/>
+          <w:sz w:val="18"/>
+          <w:szCs w:val="18"/>
+        </w:rPr>
+        <w:t>SELECT</w:t>
+      </w:r>
+    </w:p>
+    <w:p>
+      <w:r>
+        <w:rPr>
+          <w:rFonts w:ascii="Consolas" w:eastAsia="Consolas" w:hAnsi="Consolas" w:cs="Consolas"/>
+          <w:sz w:val="18"/>
+          <w:szCs w:val="18"/>
+        </w:rPr>
+        <w:t xml:space="preserve">    src_ip,</w:t>
+      </w:r>
+    </w:p>
+    <w:p>
+      <w:r>
+        <w:rPr>
+          <w:rFonts w:ascii="Consolas" w:eastAsia="Consolas" w:hAnsi="Consolas" w:cs="Consolas"/>
+          <w:sz w:val="18"/>
+          <w:szCs w:val="18"/>
+        </w:rPr>
+        <w:t xml:space="preserve">    COUNT(*) AS alert_count</w:t>
+      </w:r>
+    </w:p>
+    <w:p>
+      <w:r>
+        <w:rPr>
+          <w:rFonts w:ascii="Consolas" w:eastAsia="Consolas" w:hAnsi="Consolas" w:cs="Consolas"/>
+          <w:sz w:val="18"/>
+          <w:szCs w:val="18"/>
+        </w:rPr>
+        <w:t>FROM alerts</w:t>
+      </w:r>
+    </w:p>
+    <w:p>
+      <w:r>
+        <w:rPr>
+          <w:rFonts w:ascii="Consolas" w:eastAsia="Consolas" w:hAnsi="Consolas" w:cs="Consolas"/>
+          <w:sz w:val="18"/>
+          <w:szCs w:val="18"/>
+        </w:rPr>
+        <w:t>WHERE src_ip IS NOT NULL</w:t>
+      </w:r>
+    </w:p>
+    <w:p>
+      <w:r>
+        <w:rPr>
+          <w:rFonts w:ascii="Consolas" w:eastAsia="Consolas" w:hAnsi="Consolas" w:cs="Consolas"/>
+          <w:sz w:val="18"/>
+          <w:szCs w:val="18"/>
+        </w:rPr>
+        <w:t>GROUP BY src_ip</w:t>
+      </w:r>
+    </w:p>
+    <w:p>
+      <w:r>
+        <w:rPr>
+          <w:rFonts w:ascii="Consolas" w:eastAsia="Consolas" w:hAnsi="Consolas" w:cs="Consolas"/>
+          <w:sz w:val="18"/>
+          <w:szCs w:val="18"/>
+        </w:rPr>
+        <w:t>ORDER BY alert_count DESC</w:t>
+      </w:r>
+    </w:p>
+    <w:p>
+      <w:r>
+        <w:rPr>
+          <w:rFonts w:ascii="Consolas" w:eastAsia="Consolas" w:hAnsi="Consolas" w:cs="Consolas"/>
+          <w:sz w:val="18"/>
+          <w:szCs w:val="18"/>
+        </w:rPr>
+        <w:t>LIMIT 10;</w:t>
+      </w:r>
+    </w:p>
+    <w:p/>
+    <w:p>
+      <w:r>
+        <w:rPr>
+          <w:rFonts w:ascii="Consolas" w:eastAsia="Consolas" w:hAnsi="Consolas" w:cs="Consolas"/>
+          <w:sz w:val="18"/>
+          <w:szCs w:val="18"/>
+        </w:rPr>
+        <w:t>-- ============================================</w:t>
+      </w:r>
+    </w:p>
+    <w:p>
+      <w:r>
+        <w:rPr>
+          <w:rFonts w:ascii="Consolas" w:eastAsia="Consolas" w:hAnsi="Consolas" w:cs="Consolas"/>
+          <w:sz w:val="18"/>
+          <w:szCs w:val="18"/>
+        </w:rPr>
+        <w:t>-- TABLAS ADICIONALES</w:t>
+      </w:r>
+    </w:p>
+    <w:p>
+      <w:r>
+        <w:rPr>
+          <w:rFonts w:ascii="Consolas" w:eastAsia="Consolas" w:hAnsi="Consolas" w:cs="Consolas"/>
+          <w:sz w:val="18"/>
+          <w:szCs w:val="18"/>
+        </w:rPr>
+        <w:t>-- ============================================</w:t>
+      </w:r>
+    </w:p>
+    <w:p/>
+    <w:p>
+      <w:r>
+        <w:rPr>
+          <w:rFonts w:ascii="Consolas" w:eastAsia="Consolas" w:hAnsi="Consolas" w:cs="Consolas"/>
+          <w:sz w:val="18"/>
+          <w:szCs w:val="18"/>
+        </w:rPr>
+        <w:t>-- Tabla de incidentes (gestión de ataques detectados)</w:t>
+      </w:r>
+    </w:p>
+    <w:p>
+      <w:r>
+        <w:rPr>
+          <w:rFonts w:ascii="Consolas" w:eastAsia="Consolas" w:hAnsi="Consolas" w:cs="Consolas"/>
+          <w:sz w:val="18"/>
+          <w:szCs w:val="18"/>
+        </w:rPr>
+        <w:t>CREATE TABLE IF NOT EXISTS incidents (</w:t>
+      </w:r>
+    </w:p>
+    <w:p>
+      <w:r>
+        <w:rPr>
+          <w:rFonts w:ascii="Consolas" w:eastAsia="Consolas" w:hAnsi="Consolas" w:cs="Consolas"/>
+          <w:sz w:val="18"/>
+          <w:szCs w:val="18"/>
+        </w:rPr>
+        <w:t xml:space="preserve">    id SERIAL PRIMARY KEY,</w:t>
+      </w:r>
+    </w:p>
+    <w:p>
+      <w:r>
+        <w:rPr>
+          <w:rFonts w:ascii="Consolas" w:eastAsia="Consolas" w:hAnsi="Consolas" w:cs="Consolas"/>
+          <w:sz w:val="18"/>
+          <w:szCs w:val="18"/>
+        </w:rPr>
+        <w:t xml:space="preserve">    type TEXT,</w:t>
+      </w:r>
+    </w:p>
+    <w:p>
+      <w:r>
+        <w:rPr>
+          <w:rFonts w:ascii="Consolas" w:eastAsia="Consolas" w:hAnsi="Consolas" w:cs="Consolas"/>
+          <w:sz w:val="18"/>
+          <w:szCs w:val="18"/>
+        </w:rPr>
+        <w:t xml:space="preserve">    src_ip TEXT,</w:t>
+      </w:r>
+    </w:p>
+    <w:p>
+      <w:r>
+        <w:rPr>
+          <w:rFonts w:ascii="Consolas" w:eastAsia="Consolas" w:hAnsi="Consolas" w:cs="Consolas"/>
+          <w:sz w:val="18"/>
+          <w:szCs w:val="18"/>
+        </w:rPr>
         <w:lastRenderedPageBreak/>
-        <w:t>SELECT</w:t>
-      </w:r>
-    </w:p>
-    <w:p>
-      <w:r>
-        <w:rPr>
-          <w:rFonts w:ascii="Consolas" w:eastAsia="Consolas" w:hAnsi="Consolas" w:cs="Consolas"/>
-          <w:sz w:val="18"/>
-          <w:szCs w:val="18"/>
-        </w:rPr>
-        <w:t xml:space="preserve">    COUNT(DISTINCT p.alert_id)                                                        AS automated_alerts,</w:t>
-      </w:r>
-    </w:p>
-    <w:p>
-      <w:r>
-        <w:rPr>
-          <w:rFonts w:ascii="Consolas" w:eastAsia="Consolas" w:hAnsi="Consolas" w:cs="Consolas"/>
-          <w:sz w:val="18"/>
-          <w:szCs w:val="18"/>
-        </w:rPr>
-        <w:t xml:space="preserve">    COUNT(DISTINCT a.id)                                                              AS total_alerts,</w:t>
-      </w:r>
-    </w:p>
-    <w:p>
-      <w:r>
-        <w:rPr>
-          <w:rFonts w:ascii="Consolas" w:eastAsia="Consolas" w:hAnsi="Consolas" w:cs="Consolas"/>
-          <w:sz w:val="18"/>
-          <w:szCs w:val="18"/>
-        </w:rPr>
-        <w:t xml:space="preserve">    ROUND(COUNT(DISTINCT p.alert_id)::numeric</w:t>
-      </w:r>
-    </w:p>
-    <w:p>
-      <w:r>
-        <w:rPr>
-          <w:rFonts w:ascii="Consolas" w:eastAsia="Consolas" w:hAnsi="Consolas" w:cs="Consolas"/>
-          <w:sz w:val="18"/>
-          <w:szCs w:val="18"/>
-        </w:rPr>
-        <w:t xml:space="preserve">          / NULLIF(COUNT(DISTINCT a.id), 0) * 100, 2)                                AS automation_percentage,</w:t>
-      </w:r>
-    </w:p>
-    <w:p>
-      <w:r>
-        <w:rPr>
-          <w:rFonts w:ascii="Consolas" w:eastAsia="Consolas" w:hAnsi="Consolas" w:cs="Consolas"/>
-          <w:sz w:val="18"/>
-          <w:szCs w:val="18"/>
-        </w:rPr>
-        <w:t xml:space="preserve">    COUNT(*) FILTER (WHERE p.outcome IN (</w:t>
-      </w:r>
-    </w:p>
-    <w:p>
-      <w:r>
-        <w:rPr>
-          <w:rFonts w:ascii="Consolas" w:eastAsia="Consolas" w:hAnsi="Consolas" w:cs="Consolas"/>
-          <w:sz w:val="18"/>
-          <w:szCs w:val="18"/>
-        </w:rPr>
-        <w:t xml:space="preserve">        'success', 'incident_created', 'incident_reused', 'blocked', 'partial_success', 'logged_low'</w:t>
-      </w:r>
-    </w:p>
-    <w:p>
-      <w:r>
-        <w:rPr>
-          <w:rFonts w:ascii="Consolas" w:eastAsia="Consolas" w:hAnsi="Consolas" w:cs="Consolas"/>
-          <w:sz w:val="18"/>
-          <w:szCs w:val="18"/>
-        </w:rPr>
-        <w:t xml:space="preserve">    ))                                                                                AS successful_runs,</w:t>
-      </w:r>
-    </w:p>
-    <w:p>
-      <w:r>
-        <w:rPr>
-          <w:rFonts w:ascii="Consolas" w:eastAsia="Consolas" w:hAnsi="Consolas" w:cs="Consolas"/>
-          <w:sz w:val="18"/>
-          <w:szCs w:val="18"/>
-        </w:rPr>
-        <w:t xml:space="preserve">    COUNT(p.id)                                                                       AS total_runs,</w:t>
-      </w:r>
-    </w:p>
-    <w:p>
-      <w:r>
-        <w:rPr>
-          <w:rFonts w:ascii="Consolas" w:eastAsia="Consolas" w:hAnsi="Consolas" w:cs="Consolas"/>
-          <w:sz w:val="18"/>
-          <w:szCs w:val="18"/>
-        </w:rPr>
-        <w:t xml:space="preserve">    ROUND(COUNT(*) FILTER (WHERE p.outcome IN (</w:t>
-      </w:r>
-    </w:p>
-    <w:p>
-      <w:r>
-        <w:rPr>
-          <w:rFonts w:ascii="Consolas" w:eastAsia="Consolas" w:hAnsi="Consolas" w:cs="Consolas"/>
-          <w:sz w:val="18"/>
-          <w:szCs w:val="18"/>
-        </w:rPr>
-        <w:t xml:space="preserve">        'success', 'incident_created', 'incident_reused', 'blocked', 'partial_success', 'logged_low'</w:t>
-      </w:r>
-    </w:p>
-    <w:p>
-      <w:r>
-        <w:rPr>
-          <w:rFonts w:ascii="Consolas" w:eastAsia="Consolas" w:hAnsi="Consolas" w:cs="Consolas"/>
-          <w:sz w:val="18"/>
-          <w:szCs w:val="18"/>
-        </w:rPr>
-        <w:t xml:space="preserve">    ))::numeric / NULLIF(COUNT(p.id), 0) * 100, 2)                                   AS success_rate,</w:t>
-      </w:r>
-    </w:p>
-    <w:p>
-      <w:r>
-        <w:rPr>
-          <w:rFonts w:ascii="Consolas" w:eastAsia="Consolas" w:hAnsi="Consolas" w:cs="Consolas"/>
-          <w:sz w:val="18"/>
-          <w:szCs w:val="18"/>
-        </w:rPr>
-        <w:t xml:space="preserve">    COUNT(*) FILTER (WHERE p.outcome = 'success')           AS outcome_success,</w:t>
-      </w:r>
-    </w:p>
-    <w:p>
-      <w:r>
-        <w:rPr>
-          <w:rFonts w:ascii="Consolas" w:eastAsia="Consolas" w:hAnsi="Consolas" w:cs="Consolas"/>
-          <w:sz w:val="18"/>
-          <w:szCs w:val="18"/>
-        </w:rPr>
-        <w:t xml:space="preserve">    COUNT(*) FILTER (WHERE p.outcome = 'incident_created')  AS outcome_incident_created,</w:t>
-      </w:r>
-    </w:p>
-    <w:p>
-      <w:r>
-        <w:rPr>
-          <w:rFonts w:ascii="Consolas" w:eastAsia="Consolas" w:hAnsi="Consolas" w:cs="Consolas"/>
-          <w:sz w:val="18"/>
-          <w:szCs w:val="18"/>
-        </w:rPr>
-        <w:t xml:space="preserve">    COUNT(*) FILTER (WHERE p.outcome = 'incident_reused')   AS outcome_incident_reused,</w:t>
-      </w:r>
-    </w:p>
-    <w:p>
-      <w:r>
-        <w:rPr>
-          <w:rFonts w:ascii="Consolas" w:eastAsia="Consolas" w:hAnsi="Consolas" w:cs="Consolas"/>
-          <w:sz w:val="18"/>
-          <w:szCs w:val="18"/>
-        </w:rPr>
-        <w:t xml:space="preserve">    COUNT(*) FILTER (WHERE p.outcome = 'blocked')           AS outcome_blocked,</w:t>
-      </w:r>
-    </w:p>
-    <w:p>
-      <w:r>
-        <w:rPr>
-          <w:rFonts w:ascii="Consolas" w:eastAsia="Consolas" w:hAnsi="Consolas" w:cs="Consolas"/>
-          <w:sz w:val="18"/>
-          <w:szCs w:val="18"/>
-        </w:rPr>
-        <w:t xml:space="preserve">    COUNT(*) FILTER (WHERE p.outcome = 'partial_success')   AS outcome_partial,</w:t>
-      </w:r>
-    </w:p>
-    <w:p>
-      <w:r>
-        <w:rPr>
-          <w:rFonts w:ascii="Consolas" w:eastAsia="Consolas" w:hAnsi="Consolas" w:cs="Consolas"/>
-          <w:sz w:val="18"/>
-          <w:szCs w:val="18"/>
-        </w:rPr>
-        <w:t xml:space="preserve">    COUNT(*) FILTER (WHERE p.outcome = 'logged_low')        AS outcome_logged_low,</w:t>
-      </w:r>
-    </w:p>
-    <w:p>
-      <w:r>
-        <w:rPr>
-          <w:rFonts w:ascii="Consolas" w:eastAsia="Consolas" w:hAnsi="Consolas" w:cs="Consolas"/>
-          <w:sz w:val="18"/>
-          <w:szCs w:val="18"/>
-        </w:rPr>
-        <w:t xml:space="preserve">    COUNT(*) FILTER (WHERE p.outcome = 'failed')            AS outcome_failed</w:t>
-      </w:r>
-    </w:p>
-    <w:p>
-      <w:r>
-        <w:rPr>
-          <w:rFonts w:ascii="Consolas" w:eastAsia="Consolas" w:hAnsi="Consolas" w:cs="Consolas"/>
-          <w:sz w:val="18"/>
-          <w:szCs w:val="18"/>
-        </w:rPr>
-        <w:t>FROM alerts a</w:t>
-      </w:r>
-    </w:p>
-    <w:p>
-      <w:r>
-        <w:rPr>
-          <w:rFonts w:ascii="Consolas" w:eastAsia="Consolas" w:hAnsi="Consolas" w:cs="Consolas"/>
-          <w:sz w:val="18"/>
-          <w:szCs w:val="18"/>
-        </w:rPr>
-        <w:t>LEFT JOIN playbook_runs p ON p.alert_id = a.id</w:t>
-      </w:r>
-    </w:p>
-    <w:p>
-      <w:r>
-        <w:rPr>
-          <w:rFonts w:ascii="Consolas" w:eastAsia="Consolas" w:hAnsi="Consolas" w:cs="Consolas"/>
-          <w:sz w:val="18"/>
-          <w:szCs w:val="18"/>
-        </w:rPr>
-        <w:t>WHERE a.rule_id NOT IN ('test_fix', 'test_playbook', 'test_mejorado', 'test_telegram')</w:t>
-      </w:r>
-    </w:p>
-    <w:p>
-      <w:r>
-        <w:rPr>
-          <w:rFonts w:ascii="Consolas" w:eastAsia="Consolas" w:hAnsi="Consolas" w:cs="Consolas"/>
-          <w:sz w:val="18"/>
-          <w:szCs w:val="18"/>
-        </w:rPr>
-        <w:t xml:space="preserve">  AND a.rule_id NOT LIKE 'test%';</w:t>
+        <w:t xml:space="preserve">    username TEXT,</w:t>
+      </w:r>
+    </w:p>
+    <w:p>
+      <w:r>
+        <w:rPr>
+          <w:rFonts w:ascii="Consolas" w:eastAsia="Consolas" w:hAnsi="Consolas" w:cs="Consolas"/>
+          <w:sz w:val="18"/>
+          <w:szCs w:val="18"/>
+        </w:rPr>
+        <w:t xml:space="preserve">    attempts INTEGER,</w:t>
+      </w:r>
+    </w:p>
+    <w:p>
+      <w:r>
+        <w:rPr>
+          <w:rFonts w:ascii="Consolas" w:eastAsia="Consolas" w:hAnsi="Consolas" w:cs="Consolas"/>
+          <w:sz w:val="18"/>
+          <w:szCs w:val="18"/>
+        </w:rPr>
+        <w:t xml:space="preserve">    rule_id TEXT,</w:t>
+      </w:r>
+    </w:p>
+    <w:p>
+      <w:r>
+        <w:rPr>
+          <w:rFonts w:ascii="Consolas" w:eastAsia="Consolas" w:hAnsi="Consolas" w:cs="Consolas"/>
+          <w:sz w:val="18"/>
+          <w:szCs w:val="18"/>
+        </w:rPr>
+        <w:t xml:space="preserve">    severity TEXT,</w:t>
+      </w:r>
+    </w:p>
+    <w:p>
+      <w:r>
+        <w:rPr>
+          <w:rFonts w:ascii="Consolas" w:eastAsia="Consolas" w:hAnsi="Consolas" w:cs="Consolas"/>
+          <w:sz w:val="18"/>
+          <w:szCs w:val="18"/>
+        </w:rPr>
+        <w:t xml:space="preserve">    status TEXT DEFAULT 'open',</w:t>
+      </w:r>
+    </w:p>
+    <w:p>
+      <w:r>
+        <w:rPr>
+          <w:rFonts w:ascii="Consolas" w:eastAsia="Consolas" w:hAnsi="Consolas" w:cs="Consolas"/>
+          <w:sz w:val="18"/>
+          <w:szCs w:val="18"/>
+        </w:rPr>
+        <w:t xml:space="preserve">    created_at TIMESTAMP DEFAULT NOW()</w:t>
+      </w:r>
+    </w:p>
+    <w:p>
+      <w:r>
+        <w:rPr>
+          <w:rFonts w:ascii="Consolas" w:eastAsia="Consolas" w:hAnsi="Consolas" w:cs="Consolas"/>
+          <w:sz w:val="18"/>
+          <w:szCs w:val="18"/>
+        </w:rPr>
+        <w:t>);</w:t>
       </w:r>
     </w:p>
     <w:p/>
@@ -19001,97 +19306,17 @@
           <w:sz w:val="18"/>
           <w:szCs w:val="18"/>
         </w:rPr>
-        <w:t>-- Vista para top IPs sospechosas</w:t>
-      </w:r>
-    </w:p>
-    <w:p>
-      <w:r>
-        <w:rPr>
-          <w:rFonts w:ascii="Consolas" w:eastAsia="Consolas" w:hAnsi="Consolas" w:cs="Consolas"/>
-          <w:sz w:val="18"/>
-          <w:szCs w:val="18"/>
-        </w:rPr>
-        <w:t>CREATE OR REPLACE VIEW top_suspicious_ips AS</w:t>
-      </w:r>
-    </w:p>
-    <w:p>
-      <w:r>
-        <w:rPr>
-          <w:rFonts w:ascii="Consolas" w:eastAsia="Consolas" w:hAnsi="Consolas" w:cs="Consolas"/>
-          <w:sz w:val="18"/>
-          <w:szCs w:val="18"/>
-        </w:rPr>
-        <w:t>SELECT</w:t>
-      </w:r>
-    </w:p>
-    <w:p>
-      <w:r>
-        <w:rPr>
-          <w:rFonts w:ascii="Consolas" w:eastAsia="Consolas" w:hAnsi="Consolas" w:cs="Consolas"/>
-          <w:sz w:val="18"/>
-          <w:szCs w:val="18"/>
-        </w:rPr>
-        <w:t xml:space="preserve">    src_ip,</w:t>
-      </w:r>
-    </w:p>
-    <w:p>
-      <w:r>
-        <w:rPr>
-          <w:rFonts w:ascii="Consolas" w:eastAsia="Consolas" w:hAnsi="Consolas" w:cs="Consolas"/>
-          <w:sz w:val="18"/>
-          <w:szCs w:val="18"/>
-        </w:rPr>
-        <w:t xml:space="preserve">    COUNT(*) AS alert_count</w:t>
-      </w:r>
-    </w:p>
-    <w:p>
-      <w:r>
-        <w:rPr>
-          <w:rFonts w:ascii="Consolas" w:eastAsia="Consolas" w:hAnsi="Consolas" w:cs="Consolas"/>
-          <w:sz w:val="18"/>
-          <w:szCs w:val="18"/>
-        </w:rPr>
-        <w:t>FROM alerts</w:t>
-      </w:r>
-    </w:p>
-    <w:p>
-      <w:r>
-        <w:rPr>
-          <w:rFonts w:ascii="Consolas" w:eastAsia="Consolas" w:hAnsi="Consolas" w:cs="Consolas"/>
-          <w:sz w:val="18"/>
-          <w:szCs w:val="18"/>
-        </w:rPr>
-        <w:t>WHERE src_ip IS NOT NULL</w:t>
-      </w:r>
-    </w:p>
-    <w:p>
-      <w:r>
-        <w:rPr>
-          <w:rFonts w:ascii="Consolas" w:eastAsia="Consolas" w:hAnsi="Consolas" w:cs="Consolas"/>
-          <w:sz w:val="18"/>
-          <w:szCs w:val="18"/>
-        </w:rPr>
-        <w:t>GROUP BY src_ip</w:t>
-      </w:r>
-    </w:p>
-    <w:p>
-      <w:r>
-        <w:rPr>
-          <w:rFonts w:ascii="Consolas" w:eastAsia="Consolas" w:hAnsi="Consolas" w:cs="Consolas"/>
-          <w:sz w:val="18"/>
-          <w:szCs w:val="18"/>
-        </w:rPr>
-        <w:t>ORDER BY alert_count DESC</w:t>
-      </w:r>
-    </w:p>
-    <w:p>
-      <w:r>
-        <w:rPr>
-          <w:rFonts w:ascii="Consolas" w:eastAsia="Consolas" w:hAnsi="Consolas" w:cs="Consolas"/>
-          <w:sz w:val="18"/>
-          <w:szCs w:val="18"/>
-        </w:rPr>
-        <w:t>LIMIT 10;</w:t>
+        <w:t>CREATE INDEX IF NOT EXISTS idx_incidents_src_ip ON incidents(src_ip);</w:t>
+      </w:r>
+    </w:p>
+    <w:p>
+      <w:r>
+        <w:rPr>
+          <w:rFonts w:ascii="Consolas" w:eastAsia="Consolas" w:hAnsi="Consolas" w:cs="Consolas"/>
+          <w:sz w:val="18"/>
+          <w:szCs w:val="18"/>
+        </w:rPr>
+        <w:t>CREATE INDEX IF NOT EXISTS idx_incidents_status ON incidents(status);</w:t>
       </w:r>
     </w:p>
     <w:p/>
@@ -19102,179 +19327,6 @@
           <w:sz w:val="18"/>
           <w:szCs w:val="18"/>
         </w:rPr>
-        <w:t>-- ============================================</w:t>
-      </w:r>
-    </w:p>
-    <w:p>
-      <w:r>
-        <w:rPr>
-          <w:rFonts w:ascii="Consolas" w:eastAsia="Consolas" w:hAnsi="Consolas" w:cs="Consolas"/>
-          <w:sz w:val="18"/>
-          <w:szCs w:val="18"/>
-        </w:rPr>
-        <w:t>-- TABLAS ADICIONALES</w:t>
-      </w:r>
-    </w:p>
-    <w:p>
-      <w:r>
-        <w:rPr>
-          <w:rFonts w:ascii="Consolas" w:eastAsia="Consolas" w:hAnsi="Consolas" w:cs="Consolas"/>
-          <w:sz w:val="18"/>
-          <w:szCs w:val="18"/>
-        </w:rPr>
-        <w:t>-- ============================================</w:t>
-      </w:r>
-    </w:p>
-    <w:p/>
-    <w:p>
-      <w:r>
-        <w:rPr>
-          <w:rFonts w:ascii="Consolas" w:eastAsia="Consolas" w:hAnsi="Consolas" w:cs="Consolas"/>
-          <w:sz w:val="18"/>
-          <w:szCs w:val="18"/>
-        </w:rPr>
-        <w:t>-- Tabla de incidentes (gestión de ataques detectados)</w:t>
-      </w:r>
-    </w:p>
-    <w:p>
-      <w:r>
-        <w:rPr>
-          <w:rFonts w:ascii="Consolas" w:eastAsia="Consolas" w:hAnsi="Consolas" w:cs="Consolas"/>
-          <w:sz w:val="18"/>
-          <w:szCs w:val="18"/>
-        </w:rPr>
-        <w:t>CREATE TABLE IF NOT EXISTS incidents (</w:t>
-      </w:r>
-    </w:p>
-    <w:p>
-      <w:r>
-        <w:rPr>
-          <w:rFonts w:ascii="Consolas" w:eastAsia="Consolas" w:hAnsi="Consolas" w:cs="Consolas"/>
-          <w:sz w:val="18"/>
-          <w:szCs w:val="18"/>
-        </w:rPr>
-        <w:t xml:space="preserve">    id SERIAL PRIMARY KEY,</w:t>
-      </w:r>
-    </w:p>
-    <w:p>
-      <w:r>
-        <w:rPr>
-          <w:rFonts w:ascii="Consolas" w:eastAsia="Consolas" w:hAnsi="Consolas" w:cs="Consolas"/>
-          <w:sz w:val="18"/>
-          <w:szCs w:val="18"/>
-        </w:rPr>
-        <w:t xml:space="preserve">    type TEXT,</w:t>
-      </w:r>
-    </w:p>
-    <w:p>
-      <w:r>
-        <w:rPr>
-          <w:rFonts w:ascii="Consolas" w:eastAsia="Consolas" w:hAnsi="Consolas" w:cs="Consolas"/>
-          <w:sz w:val="18"/>
-          <w:szCs w:val="18"/>
-        </w:rPr>
-        <w:t xml:space="preserve">    src_ip TEXT,</w:t>
-      </w:r>
-    </w:p>
-    <w:p>
-      <w:r>
-        <w:rPr>
-          <w:rFonts w:ascii="Consolas" w:eastAsia="Consolas" w:hAnsi="Consolas" w:cs="Consolas"/>
-          <w:sz w:val="18"/>
-          <w:szCs w:val="18"/>
-        </w:rPr>
-        <w:t xml:space="preserve">    username TEXT,</w:t>
-      </w:r>
-    </w:p>
-    <w:p>
-      <w:r>
-        <w:rPr>
-          <w:rFonts w:ascii="Consolas" w:eastAsia="Consolas" w:hAnsi="Consolas" w:cs="Consolas"/>
-          <w:sz w:val="18"/>
-          <w:szCs w:val="18"/>
-        </w:rPr>
-        <w:t xml:space="preserve">    attempts INTEGER,</w:t>
-      </w:r>
-    </w:p>
-    <w:p>
-      <w:r>
-        <w:rPr>
-          <w:rFonts w:ascii="Consolas" w:eastAsia="Consolas" w:hAnsi="Consolas" w:cs="Consolas"/>
-          <w:sz w:val="18"/>
-          <w:szCs w:val="18"/>
-        </w:rPr>
-        <w:t xml:space="preserve">    rule_id TEXT,</w:t>
-      </w:r>
-    </w:p>
-    <w:p>
-      <w:r>
-        <w:rPr>
-          <w:rFonts w:ascii="Consolas" w:eastAsia="Consolas" w:hAnsi="Consolas" w:cs="Consolas"/>
-          <w:sz w:val="18"/>
-          <w:szCs w:val="18"/>
-        </w:rPr>
-        <w:t xml:space="preserve">    severity TEXT,</w:t>
-      </w:r>
-    </w:p>
-    <w:p>
-      <w:r>
-        <w:rPr>
-          <w:rFonts w:ascii="Consolas" w:eastAsia="Consolas" w:hAnsi="Consolas" w:cs="Consolas"/>
-          <w:sz w:val="18"/>
-          <w:szCs w:val="18"/>
-        </w:rPr>
-        <w:t xml:space="preserve">    status TEXT DEFAULT 'open',</w:t>
-      </w:r>
-    </w:p>
-    <w:p>
-      <w:r>
-        <w:rPr>
-          <w:rFonts w:ascii="Consolas" w:eastAsia="Consolas" w:hAnsi="Consolas" w:cs="Consolas"/>
-          <w:sz w:val="18"/>
-          <w:szCs w:val="18"/>
-        </w:rPr>
-        <w:t xml:space="preserve">    created_at TIMESTAMP DEFAULT NOW()</w:t>
-      </w:r>
-    </w:p>
-    <w:p>
-      <w:r>
-        <w:rPr>
-          <w:rFonts w:ascii="Consolas" w:eastAsia="Consolas" w:hAnsi="Consolas" w:cs="Consolas"/>
-          <w:sz w:val="18"/>
-          <w:szCs w:val="18"/>
-        </w:rPr>
-        <w:t>);</w:t>
-      </w:r>
-    </w:p>
-    <w:p/>
-    <w:p>
-      <w:r>
-        <w:rPr>
-          <w:rFonts w:ascii="Consolas" w:eastAsia="Consolas" w:hAnsi="Consolas" w:cs="Consolas"/>
-          <w:sz w:val="18"/>
-          <w:szCs w:val="18"/>
-        </w:rPr>
-        <w:t>CREATE INDEX IF NOT EXISTS idx_incidents_src_ip ON incidents(src_ip);</w:t>
-      </w:r>
-    </w:p>
-    <w:p>
-      <w:r>
-        <w:rPr>
-          <w:rFonts w:ascii="Consolas" w:eastAsia="Consolas" w:hAnsi="Consolas" w:cs="Consolas"/>
-          <w:sz w:val="18"/>
-          <w:szCs w:val="18"/>
-        </w:rPr>
-        <w:t>CREATE INDEX IF NOT EXISTS idx_incidents_status ON incidents(status);</w:t>
-      </w:r>
-    </w:p>
-    <w:p/>
-    <w:p>
-      <w:r>
-        <w:rPr>
-          <w:rFonts w:ascii="Consolas" w:eastAsia="Consolas" w:hAnsi="Consolas" w:cs="Consolas"/>
-          <w:sz w:val="18"/>
-          <w:szCs w:val="18"/>
-        </w:rPr>
         <w:t>-- Tabla de alertas fallidas (manejo de errores)</w:t>
       </w:r>
     </w:p>
@@ -19295,7 +19347,6 @@
           <w:sz w:val="18"/>
           <w:szCs w:val="18"/>
         </w:rPr>
-        <w:lastRenderedPageBreak/>
         <w:t xml:space="preserve">    id SERIAL PRIMARY KEY,</w:t>
       </w:r>
     </w:p>
@@ -19785,6 +19836,7 @@
           <w:sz w:val="18"/>
           <w:szCs w:val="18"/>
         </w:rPr>
+        <w:lastRenderedPageBreak/>
         <w:t xml:space="preserve">  }</w:t>
       </w:r>
     </w:p>
@@ -19910,7 +19962,6 @@
           <w:sz w:val="18"/>
           <w:szCs w:val="18"/>
         </w:rPr>
-        <w:lastRenderedPageBreak/>
         <w:t xml:space="preserve">        "message" =&gt; "Failed password for (?:invalid user )?%{USERNAME:username}"</w:t>
       </w:r>
     </w:p>
@@ -20827,6 +20878,7 @@
                 <w:sz w:val="20"/>
                 <w:szCs w:val="20"/>
               </w:rPr>
+              <w:lastRenderedPageBreak/>
               <w:t>Cobertura de fuentes</w:t>
             </w:r>
             <w:r>
@@ -21391,7 +21443,6 @@
                 <w:sz w:val="20"/>
                 <w:szCs w:val="20"/>
               </w:rPr>
-              <w:lastRenderedPageBreak/>
               <w:t>Incidentes abiertos</w:t>
             </w:r>
           </w:p>
@@ -21797,6 +21848,7 @@
           <w:b/>
           <w:bCs/>
         </w:rPr>
+        <w:lastRenderedPageBreak/>
         <w:t xml:space="preserve">Paso 5 — Verificar el arranque: </w:t>
       </w:r>
       <w:r>
@@ -21874,11 +21926,7 @@
         <w:t>.</w:t>
       </w:r>
       <w:r>
-        <w:t xml:space="preserve"> Iniciar </w:t>
-      </w:r>
-      <w:r>
-        <w:lastRenderedPageBreak/>
-        <w:t>sesión, navegar a la lista de workflows y activar el workflow SIEM – Alerta Entrante. Sin este paso el webhook no estará disponible.</w:t>
+        <w:t xml:space="preserve"> Iniciar sesión, navegar a la lista de workflows y activar el workflow SIEM – Alerta Entrante. Sin este paso el webhook no estará disponible.</w:t>
       </w:r>
     </w:p>
     <w:p>
@@ -22070,7 +22118,7 @@
           <w:sz w:val="18"/>
           <w:szCs w:val="18"/>
         </w:rPr>
-        <w:t xml:space="preserve">      POSTGRES_PASSWORD: siem123</w:t>
+        <w:t xml:space="preserve">      POSTGRES_PASSWORD: siem123  # CREDENCIAL DE LABORATORIO</w:t>
       </w:r>
     </w:p>
     <w:p>
@@ -22130,6 +22178,7 @@
           <w:sz w:val="18"/>
           <w:szCs w:val="18"/>
         </w:rPr>
+        <w:lastRenderedPageBreak/>
         <w:t xml:space="preserve">      - postgres_data:/var/lib/postgresql/data</w:t>
       </w:r>
     </w:p>
@@ -22250,7 +22299,753 @@
           <w:sz w:val="18"/>
           <w:szCs w:val="18"/>
         </w:rPr>
+        <w:t xml:space="preserve">    ports:</w:t>
+      </w:r>
+    </w:p>
+    <w:p>
+      <w:r>
+        <w:rPr>
+          <w:rFonts w:ascii="Consolas" w:eastAsia="Consolas" w:hAnsi="Consolas" w:cs="Consolas"/>
+          <w:sz w:val="18"/>
+          <w:szCs w:val="18"/>
+        </w:rPr>
+        <w:t xml:space="preserve">      - "9200:9200"</w:t>
+      </w:r>
+    </w:p>
+    <w:p>
+      <w:r>
+        <w:rPr>
+          <w:rFonts w:ascii="Consolas" w:eastAsia="Consolas" w:hAnsi="Consolas" w:cs="Consolas"/>
+          <w:sz w:val="18"/>
+          <w:szCs w:val="18"/>
+        </w:rPr>
+        <w:t xml:space="preserve">    volumes:</w:t>
+      </w:r>
+    </w:p>
+    <w:p>
+      <w:r>
+        <w:rPr>
+          <w:rFonts w:ascii="Consolas" w:eastAsia="Consolas" w:hAnsi="Consolas" w:cs="Consolas"/>
+          <w:sz w:val="18"/>
+          <w:szCs w:val="18"/>
+        </w:rPr>
+        <w:t xml:space="preserve">      - elasticsearch_data:/usr/share/elasticsearch/data</w:t>
+      </w:r>
+    </w:p>
+    <w:p>
+      <w:r>
+        <w:rPr>
+          <w:rFonts w:ascii="Consolas" w:eastAsia="Consolas" w:hAnsi="Consolas" w:cs="Consolas"/>
+          <w:sz w:val="18"/>
+          <w:szCs w:val="18"/>
+        </w:rPr>
+        <w:t xml:space="preserve">    networks:</w:t>
+      </w:r>
+    </w:p>
+    <w:p>
+      <w:r>
+        <w:rPr>
+          <w:rFonts w:ascii="Consolas" w:eastAsia="Consolas" w:hAnsi="Consolas" w:cs="Consolas"/>
+          <w:sz w:val="18"/>
+          <w:szCs w:val="18"/>
+        </w:rPr>
+        <w:t xml:space="preserve">      - siem-net</w:t>
+      </w:r>
+    </w:p>
+    <w:p>
+      <w:r>
+        <w:rPr>
+          <w:rFonts w:ascii="Consolas" w:eastAsia="Consolas" w:hAnsi="Consolas" w:cs="Consolas"/>
+          <w:sz w:val="18"/>
+          <w:szCs w:val="18"/>
+        </w:rPr>
+        <w:t xml:space="preserve">    restart: unless-stopped</w:t>
+      </w:r>
+    </w:p>
+    <w:p>
+      <w:r>
+        <w:rPr>
+          <w:rFonts w:ascii="Consolas" w:eastAsia="Consolas" w:hAnsi="Consolas" w:cs="Consolas"/>
+          <w:sz w:val="18"/>
+          <w:szCs w:val="18"/>
+        </w:rPr>
+        <w:t xml:space="preserve"> </w:t>
+      </w:r>
+    </w:p>
+    <w:p>
+      <w:r>
+        <w:rPr>
+          <w:rFonts w:ascii="Consolas" w:eastAsia="Consolas" w:hAnsi="Consolas" w:cs="Consolas"/>
+          <w:sz w:val="18"/>
+          <w:szCs w:val="18"/>
+        </w:rPr>
+        <w:t xml:space="preserve">  kibana:</w:t>
+      </w:r>
+    </w:p>
+    <w:p>
+      <w:r>
+        <w:rPr>
+          <w:rFonts w:ascii="Consolas" w:eastAsia="Consolas" w:hAnsi="Consolas" w:cs="Consolas"/>
+          <w:sz w:val="18"/>
+          <w:szCs w:val="18"/>
+        </w:rPr>
+        <w:t xml:space="preserve">    image: docker.elastic.co/kibana/kibana:8.15.0</w:t>
+      </w:r>
+    </w:p>
+    <w:p>
+      <w:r>
+        <w:rPr>
+          <w:rFonts w:ascii="Consolas" w:eastAsia="Consolas" w:hAnsi="Consolas" w:cs="Consolas"/>
+          <w:sz w:val="18"/>
+          <w:szCs w:val="18"/>
+        </w:rPr>
+        <w:t xml:space="preserve">    container_name: siem_kibana</w:t>
+      </w:r>
+    </w:p>
+    <w:p>
+      <w:r>
+        <w:rPr>
+          <w:rFonts w:ascii="Consolas" w:eastAsia="Consolas" w:hAnsi="Consolas" w:cs="Consolas"/>
+          <w:sz w:val="18"/>
+          <w:szCs w:val="18"/>
+        </w:rPr>
+        <w:t xml:space="preserve">    environment:</w:t>
+      </w:r>
+    </w:p>
+    <w:p>
+      <w:r>
+        <w:rPr>
+          <w:rFonts w:ascii="Consolas" w:eastAsia="Consolas" w:hAnsi="Consolas" w:cs="Consolas"/>
+          <w:sz w:val="18"/>
+          <w:szCs w:val="18"/>
+        </w:rPr>
+        <w:t xml:space="preserve">      - ELASTICSEARCH_HOSTS=http://elasticsearch:9200</w:t>
+      </w:r>
+    </w:p>
+    <w:p>
+      <w:r>
+        <w:rPr>
+          <w:rFonts w:ascii="Consolas" w:eastAsia="Consolas" w:hAnsi="Consolas" w:cs="Consolas"/>
+          <w:sz w:val="18"/>
+          <w:szCs w:val="18"/>
+        </w:rPr>
+        <w:t xml:space="preserve">    ports:</w:t>
+      </w:r>
+    </w:p>
+    <w:p>
+      <w:r>
+        <w:rPr>
+          <w:rFonts w:ascii="Consolas" w:eastAsia="Consolas" w:hAnsi="Consolas" w:cs="Consolas"/>
+          <w:sz w:val="18"/>
+          <w:szCs w:val="18"/>
+        </w:rPr>
+        <w:t xml:space="preserve">      - "5601:5601"</w:t>
+      </w:r>
+    </w:p>
+    <w:p>
+      <w:r>
+        <w:rPr>
+          <w:rFonts w:ascii="Consolas" w:eastAsia="Consolas" w:hAnsi="Consolas" w:cs="Consolas"/>
+          <w:sz w:val="18"/>
+          <w:szCs w:val="18"/>
+        </w:rPr>
+        <w:t xml:space="preserve">    networks:</w:t>
+      </w:r>
+    </w:p>
+    <w:p>
+      <w:r>
+        <w:rPr>
+          <w:rFonts w:ascii="Consolas" w:eastAsia="Consolas" w:hAnsi="Consolas" w:cs="Consolas"/>
+          <w:sz w:val="18"/>
+          <w:szCs w:val="18"/>
+        </w:rPr>
+        <w:t xml:space="preserve">      - siem-net</w:t>
+      </w:r>
+    </w:p>
+    <w:p>
+      <w:r>
+        <w:rPr>
+          <w:rFonts w:ascii="Consolas" w:eastAsia="Consolas" w:hAnsi="Consolas" w:cs="Consolas"/>
+          <w:sz w:val="18"/>
+          <w:szCs w:val="18"/>
+        </w:rPr>
+        <w:t xml:space="preserve">    depends_on:</w:t>
+      </w:r>
+    </w:p>
+    <w:p>
+      <w:r>
+        <w:rPr>
+          <w:rFonts w:ascii="Consolas" w:eastAsia="Consolas" w:hAnsi="Consolas" w:cs="Consolas"/>
+          <w:sz w:val="18"/>
+          <w:szCs w:val="18"/>
+        </w:rPr>
+        <w:t xml:space="preserve">      - elasticsearch</w:t>
+      </w:r>
+    </w:p>
+    <w:p>
+      <w:r>
+        <w:rPr>
+          <w:rFonts w:ascii="Consolas" w:eastAsia="Consolas" w:hAnsi="Consolas" w:cs="Consolas"/>
+          <w:sz w:val="18"/>
+          <w:szCs w:val="18"/>
+        </w:rPr>
+        <w:t xml:space="preserve">    restart: unless-stopped</w:t>
+      </w:r>
+    </w:p>
+    <w:p>
+      <w:r>
+        <w:rPr>
+          <w:rFonts w:ascii="Consolas" w:eastAsia="Consolas" w:hAnsi="Consolas" w:cs="Consolas"/>
+          <w:sz w:val="18"/>
+          <w:szCs w:val="18"/>
+        </w:rPr>
+        <w:t xml:space="preserve"> </w:t>
+      </w:r>
+    </w:p>
+    <w:p>
+      <w:r>
+        <w:rPr>
+          <w:rFonts w:ascii="Consolas" w:eastAsia="Consolas" w:hAnsi="Consolas" w:cs="Consolas"/>
+          <w:sz w:val="18"/>
+          <w:szCs w:val="18"/>
+        </w:rPr>
+        <w:t xml:space="preserve">  logstash:</w:t>
+      </w:r>
+    </w:p>
+    <w:p>
+      <w:r>
+        <w:rPr>
+          <w:rFonts w:ascii="Consolas" w:eastAsia="Consolas" w:hAnsi="Consolas" w:cs="Consolas"/>
+          <w:sz w:val="18"/>
+          <w:szCs w:val="18"/>
+        </w:rPr>
+        <w:t xml:space="preserve">    image: docker.elastic.co/logstash/logstash:8.15.0</w:t>
+      </w:r>
+    </w:p>
+    <w:p>
+      <w:r>
+        <w:rPr>
+          <w:rFonts w:ascii="Consolas" w:eastAsia="Consolas" w:hAnsi="Consolas" w:cs="Consolas"/>
+          <w:sz w:val="18"/>
+          <w:szCs w:val="18"/>
+        </w:rPr>
+        <w:t xml:space="preserve">    container_name: siem_logstash</w:t>
+      </w:r>
+    </w:p>
+    <w:p>
+      <w:r>
+        <w:rPr>
+          <w:rFonts w:ascii="Consolas" w:eastAsia="Consolas" w:hAnsi="Consolas" w:cs="Consolas"/>
+          <w:sz w:val="18"/>
+          <w:szCs w:val="18"/>
+        </w:rPr>
+        <w:t xml:space="preserve">    volumes:</w:t>
+      </w:r>
+    </w:p>
+    <w:p>
+      <w:r>
+        <w:rPr>
+          <w:rFonts w:ascii="Consolas" w:eastAsia="Consolas" w:hAnsi="Consolas" w:cs="Consolas"/>
+          <w:sz w:val="18"/>
+          <w:szCs w:val="18"/>
+        </w:rPr>
+        <w:t xml:space="preserve">      - ./logstash/logstash.conf:/usr/share/logstash/pipeline/logstash.conf</w:t>
+      </w:r>
+    </w:p>
+    <w:p>
+      <w:r>
+        <w:rPr>
+          <w:rFonts w:ascii="Consolas" w:eastAsia="Consolas" w:hAnsi="Consolas" w:cs="Consolas"/>
+          <w:sz w:val="18"/>
+          <w:szCs w:val="18"/>
+        </w:rPr>
+        <w:t xml:space="preserve">    ports:</w:t>
+      </w:r>
+    </w:p>
+    <w:p>
+      <w:r>
+        <w:rPr>
+          <w:rFonts w:ascii="Consolas" w:eastAsia="Consolas" w:hAnsi="Consolas" w:cs="Consolas"/>
+          <w:sz w:val="18"/>
+          <w:szCs w:val="18"/>
+        </w:rPr>
+        <w:t xml:space="preserve">      - "5140:5140/udp"</w:t>
+      </w:r>
+    </w:p>
+    <w:p>
+      <w:r>
+        <w:rPr>
+          <w:rFonts w:ascii="Consolas" w:eastAsia="Consolas" w:hAnsi="Consolas" w:cs="Consolas"/>
+          <w:sz w:val="18"/>
+          <w:szCs w:val="18"/>
+        </w:rPr>
+        <w:t xml:space="preserve">    networks:</w:t>
+      </w:r>
+    </w:p>
+    <w:p>
+      <w:r>
+        <w:rPr>
+          <w:rFonts w:ascii="Consolas" w:eastAsia="Consolas" w:hAnsi="Consolas" w:cs="Consolas"/>
+          <w:sz w:val="18"/>
+          <w:szCs w:val="18"/>
+        </w:rPr>
+        <w:t xml:space="preserve">      - siem-net</w:t>
+      </w:r>
+    </w:p>
+    <w:p>
+      <w:r>
+        <w:rPr>
+          <w:rFonts w:ascii="Consolas" w:eastAsia="Consolas" w:hAnsi="Consolas" w:cs="Consolas"/>
+          <w:sz w:val="18"/>
+          <w:szCs w:val="18"/>
+        </w:rPr>
+        <w:t xml:space="preserve">    depends_on:</w:t>
+      </w:r>
+    </w:p>
+    <w:p>
+      <w:r>
+        <w:rPr>
+          <w:rFonts w:ascii="Consolas" w:eastAsia="Consolas" w:hAnsi="Consolas" w:cs="Consolas"/>
+          <w:sz w:val="18"/>
+          <w:szCs w:val="18"/>
+        </w:rPr>
+        <w:t xml:space="preserve">      - elasticsearch</w:t>
+      </w:r>
+    </w:p>
+    <w:p>
+      <w:r>
+        <w:rPr>
+          <w:rFonts w:ascii="Consolas" w:eastAsia="Consolas" w:hAnsi="Consolas" w:cs="Consolas"/>
+          <w:sz w:val="18"/>
+          <w:szCs w:val="18"/>
+        </w:rPr>
+        <w:t xml:space="preserve">      - postgres</w:t>
+      </w:r>
+    </w:p>
+    <w:p>
+      <w:r>
+        <w:rPr>
+          <w:rFonts w:ascii="Consolas" w:eastAsia="Consolas" w:hAnsi="Consolas" w:cs="Consolas"/>
+          <w:sz w:val="18"/>
+          <w:szCs w:val="18"/>
+        </w:rPr>
+        <w:t xml:space="preserve">    restart: unless-stopped</w:t>
+      </w:r>
+    </w:p>
+    <w:p>
+      <w:r>
+        <w:rPr>
+          <w:rFonts w:ascii="Consolas" w:eastAsia="Consolas" w:hAnsi="Consolas" w:cs="Consolas"/>
+          <w:sz w:val="18"/>
+          <w:szCs w:val="18"/>
+        </w:rPr>
+        <w:t xml:space="preserve"> </w:t>
+      </w:r>
+    </w:p>
+    <w:p>
+      <w:r>
+        <w:rPr>
+          <w:rFonts w:ascii="Consolas" w:eastAsia="Consolas" w:hAnsi="Consolas" w:cs="Consolas"/>
+          <w:sz w:val="18"/>
+          <w:szCs w:val="18"/>
+        </w:rPr>
+        <w:t xml:space="preserve">  syslog-ng:</w:t>
+      </w:r>
+    </w:p>
+    <w:p>
+      <w:r>
+        <w:rPr>
+          <w:rFonts w:ascii="Consolas" w:eastAsia="Consolas" w:hAnsi="Consolas" w:cs="Consolas"/>
+          <w:sz w:val="18"/>
+          <w:szCs w:val="18"/>
+        </w:rPr>
+        <w:t xml:space="preserve">    image: balabit/syslog-ng:4.8.0</w:t>
+      </w:r>
+    </w:p>
+    <w:p>
+      <w:r>
+        <w:rPr>
+          <w:rFonts w:ascii="Consolas" w:eastAsia="Consolas" w:hAnsi="Consolas" w:cs="Consolas"/>
+          <w:sz w:val="18"/>
+          <w:szCs w:val="18"/>
+        </w:rPr>
+        <w:t xml:space="preserve">    container_name: siem_syslog</w:t>
+      </w:r>
+    </w:p>
+    <w:p>
+      <w:r>
+        <w:rPr>
+          <w:rFonts w:ascii="Consolas" w:eastAsia="Consolas" w:hAnsi="Consolas" w:cs="Consolas"/>
+          <w:sz w:val="18"/>
+          <w:szCs w:val="18"/>
+        </w:rPr>
+        <w:t xml:space="preserve">    volumes:</w:t>
+      </w:r>
+    </w:p>
+    <w:p>
+      <w:r>
+        <w:rPr>
+          <w:rFonts w:ascii="Consolas" w:eastAsia="Consolas" w:hAnsi="Consolas" w:cs="Consolas"/>
+          <w:sz w:val="18"/>
+          <w:szCs w:val="18"/>
+        </w:rPr>
+        <w:t xml:space="preserve">      - ./syslog-ng/syslog-ng.conf:/etc/syslog-ng/syslog-ng.conf</w:t>
+      </w:r>
+    </w:p>
+    <w:p>
+      <w:r>
+        <w:rPr>
+          <w:rFonts w:ascii="Consolas" w:eastAsia="Consolas" w:hAnsi="Consolas" w:cs="Consolas"/>
+          <w:sz w:val="18"/>
+          <w:szCs w:val="18"/>
+        </w:rPr>
+        <w:t xml:space="preserve">    ports:</w:t>
+      </w:r>
+    </w:p>
+    <w:p>
+      <w:r>
+        <w:rPr>
+          <w:rFonts w:ascii="Consolas" w:eastAsia="Consolas" w:hAnsi="Consolas" w:cs="Consolas"/>
+          <w:sz w:val="18"/>
+          <w:szCs w:val="18"/>
+        </w:rPr>
+        <w:t xml:space="preserve">      - "514:514/udp"</w:t>
+      </w:r>
+    </w:p>
+    <w:p>
+      <w:r>
+        <w:rPr>
+          <w:rFonts w:ascii="Consolas" w:eastAsia="Consolas" w:hAnsi="Consolas" w:cs="Consolas"/>
+          <w:sz w:val="18"/>
+          <w:szCs w:val="18"/>
+        </w:rPr>
+        <w:t xml:space="preserve">    networks:</w:t>
+      </w:r>
+    </w:p>
+    <w:p>
+      <w:r>
+        <w:rPr>
+          <w:rFonts w:ascii="Consolas" w:eastAsia="Consolas" w:hAnsi="Consolas" w:cs="Consolas"/>
+          <w:sz w:val="18"/>
+          <w:szCs w:val="18"/>
+        </w:rPr>
+        <w:t xml:space="preserve">      - siem-net</w:t>
+      </w:r>
+    </w:p>
+    <w:p>
+      <w:r>
+        <w:rPr>
+          <w:rFonts w:ascii="Consolas" w:eastAsia="Consolas" w:hAnsi="Consolas" w:cs="Consolas"/>
+          <w:sz w:val="18"/>
+          <w:szCs w:val="18"/>
+        </w:rPr>
+        <w:t xml:space="preserve">    depends_on:</w:t>
+      </w:r>
+    </w:p>
+    <w:p>
+      <w:r>
+        <w:rPr>
+          <w:rFonts w:ascii="Consolas" w:eastAsia="Consolas" w:hAnsi="Consolas" w:cs="Consolas"/>
+          <w:sz w:val="18"/>
+          <w:szCs w:val="18"/>
+        </w:rPr>
+        <w:t xml:space="preserve">      - logstash</w:t>
+      </w:r>
+    </w:p>
+    <w:p>
+      <w:r>
+        <w:rPr>
+          <w:rFonts w:ascii="Consolas" w:eastAsia="Consolas" w:hAnsi="Consolas" w:cs="Consolas"/>
+          <w:sz w:val="18"/>
+          <w:szCs w:val="18"/>
+        </w:rPr>
+        <w:t xml:space="preserve">    restart: unless-stopped</w:t>
+      </w:r>
+    </w:p>
+    <w:p>
+      <w:r>
+        <w:rPr>
+          <w:rFonts w:ascii="Consolas" w:eastAsia="Consolas" w:hAnsi="Consolas" w:cs="Consolas"/>
+          <w:sz w:val="18"/>
+          <w:szCs w:val="18"/>
+        </w:rPr>
+        <w:t xml:space="preserve"> </w:t>
+      </w:r>
+    </w:p>
+    <w:p>
+      <w:r>
+        <w:rPr>
+          <w:rFonts w:ascii="Consolas" w:eastAsia="Consolas" w:hAnsi="Consolas" w:cs="Consolas"/>
+          <w:sz w:val="18"/>
+          <w:szCs w:val="18"/>
+        </w:rPr>
+        <w:t xml:space="preserve">  n8n:</w:t>
+      </w:r>
+    </w:p>
+    <w:p>
+      <w:r>
+        <w:rPr>
+          <w:rFonts w:ascii="Consolas" w:eastAsia="Consolas" w:hAnsi="Consolas" w:cs="Consolas"/>
+          <w:sz w:val="18"/>
+          <w:szCs w:val="18"/>
+        </w:rPr>
+        <w:t xml:space="preserve">    image: n8nio/n8n:2.1.5</w:t>
+      </w:r>
+    </w:p>
+    <w:p>
+      <w:r>
+        <w:rPr>
+          <w:rFonts w:ascii="Consolas" w:eastAsia="Consolas" w:hAnsi="Consolas" w:cs="Consolas"/>
+          <w:sz w:val="18"/>
+          <w:szCs w:val="18"/>
+        </w:rPr>
+        <w:t xml:space="preserve">    container_name: siem_n8n</w:t>
+      </w:r>
+    </w:p>
+    <w:p>
+      <w:pPr>
+        <w:rPr>
+          <w:u w:val="single"/>
+        </w:rPr>
+      </w:pPr>
+      <w:r>
+        <w:rPr>
+          <w:rFonts w:ascii="Consolas" w:eastAsia="Consolas" w:hAnsi="Consolas" w:cs="Consolas"/>
+          <w:sz w:val="18"/>
+          <w:szCs w:val="18"/>
+        </w:rPr>
+        <w:t xml:space="preserve">    ports:</w:t>
+      </w:r>
+    </w:p>
+    <w:p>
+      <w:r>
+        <w:rPr>
+          <w:rFonts w:ascii="Consolas" w:eastAsia="Consolas" w:hAnsi="Consolas" w:cs="Consolas"/>
+          <w:sz w:val="18"/>
+          <w:szCs w:val="18"/>
+        </w:rPr>
+        <w:t xml:space="preserve">      - "5678:5678"</w:t>
+      </w:r>
+    </w:p>
+    <w:p>
+      <w:r>
+        <w:rPr>
+          <w:rFonts w:ascii="Consolas" w:eastAsia="Consolas" w:hAnsi="Consolas" w:cs="Consolas"/>
+          <w:sz w:val="18"/>
+          <w:szCs w:val="18"/>
+        </w:rPr>
         <w:lastRenderedPageBreak/>
+        <w:t xml:space="preserve">    environment:</w:t>
+      </w:r>
+    </w:p>
+    <w:p>
+      <w:r>
+        <w:rPr>
+          <w:rFonts w:ascii="Consolas" w:eastAsia="Consolas" w:hAnsi="Consolas" w:cs="Consolas"/>
+          <w:sz w:val="18"/>
+          <w:szCs w:val="18"/>
+        </w:rPr>
+        <w:t xml:space="preserve">      - DB_TYPE=postgresdb</w:t>
+      </w:r>
+    </w:p>
+    <w:p>
+      <w:r>
+        <w:rPr>
+          <w:rFonts w:ascii="Consolas" w:eastAsia="Consolas" w:hAnsi="Consolas" w:cs="Consolas"/>
+          <w:sz w:val="18"/>
+          <w:szCs w:val="18"/>
+        </w:rPr>
+        <w:t xml:space="preserve">      - DB_POSTGRESDB_HOST=postgres</w:t>
+      </w:r>
+    </w:p>
+    <w:p>
+      <w:r>
+        <w:rPr>
+          <w:rFonts w:ascii="Consolas" w:eastAsia="Consolas" w:hAnsi="Consolas" w:cs="Consolas"/>
+          <w:sz w:val="18"/>
+          <w:szCs w:val="18"/>
+        </w:rPr>
+        <w:t xml:space="preserve">      - DB_POSTGRESDB_PORT=5432</w:t>
+      </w:r>
+    </w:p>
+    <w:p>
+      <w:r>
+        <w:rPr>
+          <w:rFonts w:ascii="Consolas" w:eastAsia="Consolas" w:hAnsi="Consolas" w:cs="Consolas"/>
+          <w:sz w:val="18"/>
+          <w:szCs w:val="18"/>
+        </w:rPr>
+        <w:t xml:space="preserve">      - DB_POSTGRESDB_DATABASE=siem</w:t>
+      </w:r>
+    </w:p>
+    <w:p>
+      <w:r>
+        <w:rPr>
+          <w:rFonts w:ascii="Consolas" w:eastAsia="Consolas" w:hAnsi="Consolas" w:cs="Consolas"/>
+          <w:sz w:val="18"/>
+          <w:szCs w:val="18"/>
+        </w:rPr>
+        <w:t xml:space="preserve">      - DB_POSTGRESDB_USER=siem</w:t>
+      </w:r>
+    </w:p>
+    <w:p>
+      <w:pPr>
+        <w:rPr>
+          <w:rFonts w:ascii="Consolas" w:eastAsia="Consolas" w:hAnsi="Consolas" w:cs="Consolas"/>
+          <w:sz w:val="18"/>
+          <w:szCs w:val="18"/>
+        </w:rPr>
+      </w:pPr>
+      <w:r>
+        <w:rPr>
+          <w:rFonts w:ascii="Consolas" w:eastAsia="Consolas" w:hAnsi="Consolas" w:cs="Consolas"/>
+          <w:sz w:val="18"/>
+          <w:szCs w:val="18"/>
+        </w:rPr>
+        <w:t xml:space="preserve">      - DB_POSTGRESDB_PASSWORD=siem123</w:t>
+      </w:r>
+    </w:p>
+    <w:p>
+      <w:pPr>
+        <w:rPr>
+          <w:rFonts w:ascii="Consolas" w:eastAsia="Consolas" w:hAnsi="Consolas" w:cs="Consolas"/>
+          <w:sz w:val="18"/>
+          <w:szCs w:val="18"/>
+        </w:rPr>
+      </w:pPr>
+      <w:r>
+        <w:t xml:space="preserve">      # N8N_BASIC_AUTH_* deprecado en esta version de n8n (gestion de usuarios nativa</w:t>
+      </w:r>
+    </w:p>
+    <w:p>
+      <w:pPr>
+        <w:rPr>
+          <w:rFonts w:ascii="Consolas" w:eastAsia="Consolas" w:hAnsi="Consolas" w:cs="Consolas"/>
+          <w:sz w:val="18"/>
+          <w:szCs w:val="18"/>
+        </w:rPr>
+      </w:pPr>
+      <w:r>
+        <w:t xml:space="preserve">      # con cuenta de owner, ver Anexo E paso 6 y seccion 7.2.7 de la tesis)</w:t>
+      </w:r>
+    </w:p>
+    <w:p>
+      <w:r>
+        <w:rPr>
+          <w:rFonts w:ascii="Consolas" w:eastAsia="Consolas" w:hAnsi="Consolas" w:cs="Consolas"/>
+          <w:sz w:val="18"/>
+          <w:szCs w:val="18"/>
+        </w:rPr>
+        <w:t xml:space="preserve">    volumes:</w:t>
+      </w:r>
+    </w:p>
+    <w:p>
+      <w:r>
+        <w:rPr>
+          <w:rFonts w:ascii="Consolas" w:eastAsia="Consolas" w:hAnsi="Consolas" w:cs="Consolas"/>
+          <w:sz w:val="18"/>
+          <w:szCs w:val="18"/>
+        </w:rPr>
+        <w:t xml:space="preserve">      - n8n_data:/home/node/.n8n</w:t>
+      </w:r>
+    </w:p>
+    <w:p>
+      <w:r>
+        <w:rPr>
+          <w:rFonts w:ascii="Consolas" w:eastAsia="Consolas" w:hAnsi="Consolas" w:cs="Consolas"/>
+          <w:sz w:val="18"/>
+          <w:szCs w:val="18"/>
+        </w:rPr>
+        <w:t xml:space="preserve">    networks:</w:t>
+      </w:r>
+    </w:p>
+    <w:p>
+      <w:r>
+        <w:rPr>
+          <w:rFonts w:ascii="Consolas" w:eastAsia="Consolas" w:hAnsi="Consolas" w:cs="Consolas"/>
+          <w:sz w:val="18"/>
+          <w:szCs w:val="18"/>
+        </w:rPr>
+        <w:t xml:space="preserve">      - siem-net</w:t>
+      </w:r>
+    </w:p>
+    <w:p>
+      <w:r>
+        <w:rPr>
+          <w:rFonts w:ascii="Consolas" w:eastAsia="Consolas" w:hAnsi="Consolas" w:cs="Consolas"/>
+          <w:sz w:val="18"/>
+          <w:szCs w:val="18"/>
+        </w:rPr>
+        <w:t xml:space="preserve">    depends_on:</w:t>
+      </w:r>
+    </w:p>
+    <w:p>
+      <w:r>
+        <w:rPr>
+          <w:rFonts w:ascii="Consolas" w:eastAsia="Consolas" w:hAnsi="Consolas" w:cs="Consolas"/>
+          <w:sz w:val="18"/>
+          <w:szCs w:val="18"/>
+        </w:rPr>
+        <w:t xml:space="preserve">      - postgres</w:t>
+      </w:r>
+    </w:p>
+    <w:p>
+      <w:r>
+        <w:rPr>
+          <w:rFonts w:ascii="Consolas" w:eastAsia="Consolas" w:hAnsi="Consolas" w:cs="Consolas"/>
+          <w:sz w:val="18"/>
+          <w:szCs w:val="18"/>
+        </w:rPr>
+        <w:t xml:space="preserve">    restart: unless-stopped</w:t>
+      </w:r>
+    </w:p>
+    <w:p>
+      <w:r>
+        <w:rPr>
+          <w:rFonts w:ascii="Consolas" w:eastAsia="Consolas" w:hAnsi="Consolas" w:cs="Consolas"/>
+          <w:sz w:val="18"/>
+          <w:szCs w:val="18"/>
+        </w:rPr>
+        <w:t xml:space="preserve"> </w:t>
+      </w:r>
+    </w:p>
+    <w:p>
+      <w:r>
+        <w:rPr>
+          <w:rFonts w:ascii="Consolas" w:eastAsia="Consolas" w:hAnsi="Consolas" w:cs="Consolas"/>
+          <w:sz w:val="18"/>
+          <w:szCs w:val="18"/>
+        </w:rPr>
+        <w:t xml:space="preserve">  dashboard:</w:t>
+      </w:r>
+    </w:p>
+    <w:p>
+      <w:r>
+        <w:rPr>
+          <w:rFonts w:ascii="Consolas" w:eastAsia="Consolas" w:hAnsi="Consolas" w:cs="Consolas"/>
+          <w:sz w:val="18"/>
+          <w:szCs w:val="18"/>
+        </w:rPr>
+        <w:t xml:space="preserve">    build: ./dashboard</w:t>
+      </w:r>
+    </w:p>
+    <w:p>
+      <w:r>
+        <w:rPr>
+          <w:rFonts w:ascii="Consolas" w:eastAsia="Consolas" w:hAnsi="Consolas" w:cs="Consolas"/>
+          <w:sz w:val="18"/>
+          <w:szCs w:val="18"/>
+        </w:rPr>
+        <w:t xml:space="preserve">    container_name: siem_dashboard</w:t>
+      </w:r>
+    </w:p>
+    <w:p>
+      <w:r>
+        <w:rPr>
+          <w:rFonts w:ascii="Consolas" w:eastAsia="Consolas" w:hAnsi="Consolas" w:cs="Consolas"/>
+          <w:sz w:val="18"/>
+          <w:szCs w:val="18"/>
+        </w:rPr>
         <w:t xml:space="preserve">    ports:</w:t>
       </w:r>
     </w:p>
@@ -22261,7 +23056,227 @@
           <w:sz w:val="18"/>
           <w:szCs w:val="18"/>
         </w:rPr>
-        <w:t xml:space="preserve">      - "9200:9200"</w:t>
+        <w:t xml:space="preserve">      - "8501:8501"</w:t>
+      </w:r>
+    </w:p>
+    <w:p>
+      <w:r>
+        <w:rPr>
+          <w:rFonts w:ascii="Consolas" w:eastAsia="Consolas" w:hAnsi="Consolas" w:cs="Consolas"/>
+          <w:sz w:val="18"/>
+          <w:szCs w:val="18"/>
+        </w:rPr>
+        <w:t xml:space="preserve">    environment:</w:t>
+      </w:r>
+    </w:p>
+    <w:p>
+      <w:r>
+        <w:rPr>
+          <w:rFonts w:ascii="Consolas" w:eastAsia="Consolas" w:hAnsi="Consolas" w:cs="Consolas"/>
+          <w:sz w:val="18"/>
+          <w:szCs w:val="18"/>
+        </w:rPr>
+        <w:t xml:space="preserve">      - DB_HOST=postgres</w:t>
+      </w:r>
+    </w:p>
+    <w:p>
+      <w:r>
+        <w:rPr>
+          <w:rFonts w:ascii="Consolas" w:eastAsia="Consolas" w:hAnsi="Consolas" w:cs="Consolas"/>
+          <w:sz w:val="18"/>
+          <w:szCs w:val="18"/>
+        </w:rPr>
+        <w:t xml:space="preserve">      - DB_PORT=5432</w:t>
+      </w:r>
+    </w:p>
+    <w:p>
+      <w:r>
+        <w:rPr>
+          <w:rFonts w:ascii="Consolas" w:eastAsia="Consolas" w:hAnsi="Consolas" w:cs="Consolas"/>
+          <w:sz w:val="18"/>
+          <w:szCs w:val="18"/>
+        </w:rPr>
+        <w:t xml:space="preserve">      - DB_NAME=siem</w:t>
+      </w:r>
+    </w:p>
+    <w:p>
+      <w:r>
+        <w:rPr>
+          <w:rFonts w:ascii="Consolas" w:eastAsia="Consolas" w:hAnsi="Consolas" w:cs="Consolas"/>
+          <w:sz w:val="18"/>
+          <w:szCs w:val="18"/>
+        </w:rPr>
+        <w:t xml:space="preserve">      - DB_USER=siem</w:t>
+      </w:r>
+    </w:p>
+    <w:p>
+      <w:r>
+        <w:rPr>
+          <w:rFonts w:ascii="Consolas" w:eastAsia="Consolas" w:hAnsi="Consolas" w:cs="Consolas"/>
+          <w:sz w:val="18"/>
+          <w:szCs w:val="18"/>
+        </w:rPr>
+        <w:t xml:space="preserve">      - DB_PASSWORD=siem123  # CREDENCIAL DE LABORATORIO</w:t>
+      </w:r>
+    </w:p>
+    <w:p>
+      <w:r>
+        <w:rPr>
+          <w:rFonts w:ascii="Consolas" w:eastAsia="Consolas" w:hAnsi="Consolas" w:cs="Consolas"/>
+          <w:sz w:val="18"/>
+          <w:szCs w:val="18"/>
+        </w:rPr>
+        <w:t xml:space="preserve">    networks:</w:t>
+      </w:r>
+    </w:p>
+    <w:p>
+      <w:r>
+        <w:rPr>
+          <w:rFonts w:ascii="Consolas" w:eastAsia="Consolas" w:hAnsi="Consolas" w:cs="Consolas"/>
+          <w:sz w:val="18"/>
+          <w:szCs w:val="18"/>
+        </w:rPr>
+        <w:t xml:space="preserve">      - siem-net</w:t>
+      </w:r>
+    </w:p>
+    <w:p>
+      <w:r>
+        <w:rPr>
+          <w:rFonts w:ascii="Consolas" w:eastAsia="Consolas" w:hAnsi="Consolas" w:cs="Consolas"/>
+          <w:sz w:val="18"/>
+          <w:szCs w:val="18"/>
+        </w:rPr>
+        <w:t xml:space="preserve">    depends_on:</w:t>
+      </w:r>
+    </w:p>
+    <w:p>
+      <w:r>
+        <w:rPr>
+          <w:rFonts w:ascii="Consolas" w:eastAsia="Consolas" w:hAnsi="Consolas" w:cs="Consolas"/>
+          <w:sz w:val="18"/>
+          <w:szCs w:val="18"/>
+        </w:rPr>
+        <w:t xml:space="preserve">      - postgres</w:t>
+      </w:r>
+    </w:p>
+    <w:p>
+      <w:r>
+        <w:rPr>
+          <w:rFonts w:ascii="Consolas" w:eastAsia="Consolas" w:hAnsi="Consolas" w:cs="Consolas"/>
+          <w:sz w:val="18"/>
+          <w:szCs w:val="18"/>
+        </w:rPr>
+        <w:t xml:space="preserve">    restart: unless-stopped</w:t>
+      </w:r>
+    </w:p>
+    <w:p>
+      <w:r>
+        <w:rPr>
+          <w:rFonts w:ascii="Consolas" w:eastAsia="Consolas" w:hAnsi="Consolas" w:cs="Consolas"/>
+          <w:sz w:val="18"/>
+          <w:szCs w:val="18"/>
+        </w:rPr>
+        <w:t xml:space="preserve"> </w:t>
+      </w:r>
+    </w:p>
+    <w:p>
+      <w:r>
+        <w:rPr>
+          <w:rFonts w:ascii="Consolas" w:eastAsia="Consolas" w:hAnsi="Consolas" w:cs="Consolas"/>
+          <w:sz w:val="18"/>
+          <w:szCs w:val="18"/>
+        </w:rPr>
+        <w:t xml:space="preserve">  grafana:</w:t>
+      </w:r>
+    </w:p>
+    <w:p>
+      <w:pPr>
+        <w:rPr>
+          <w:u w:val="single"/>
+        </w:rPr>
+      </w:pPr>
+      <w:r>
+        <w:rPr>
+          <w:rFonts w:ascii="Consolas" w:eastAsia="Consolas" w:hAnsi="Consolas" w:cs="Consolas"/>
+          <w:sz w:val="18"/>
+          <w:szCs w:val="18"/>
+        </w:rPr>
+        <w:t xml:space="preserve">    image: grafana/grafana:11.1.0</w:t>
+      </w:r>
+    </w:p>
+    <w:p>
+      <w:r>
+        <w:rPr>
+          <w:rFonts w:ascii="Consolas" w:eastAsia="Consolas" w:hAnsi="Consolas" w:cs="Consolas"/>
+          <w:sz w:val="18"/>
+          <w:szCs w:val="18"/>
+        </w:rPr>
+        <w:t xml:space="preserve">    container_name: siem_grafana</w:t>
+      </w:r>
+    </w:p>
+    <w:p>
+      <w:r>
+        <w:rPr>
+          <w:rFonts w:ascii="Consolas" w:eastAsia="Consolas" w:hAnsi="Consolas" w:cs="Consolas"/>
+          <w:sz w:val="18"/>
+          <w:szCs w:val="18"/>
+        </w:rPr>
+        <w:t xml:space="preserve">    ports:</w:t>
+      </w:r>
+    </w:p>
+    <w:p>
+      <w:r>
+        <w:rPr>
+          <w:rFonts w:ascii="Consolas" w:eastAsia="Consolas" w:hAnsi="Consolas" w:cs="Consolas"/>
+          <w:sz w:val="18"/>
+          <w:szCs w:val="18"/>
+        </w:rPr>
+        <w:t xml:space="preserve">      - "3000:3000"</w:t>
+      </w:r>
+    </w:p>
+    <w:p>
+      <w:r>
+        <w:rPr>
+          <w:rFonts w:ascii="Consolas" w:eastAsia="Consolas" w:hAnsi="Consolas" w:cs="Consolas"/>
+          <w:sz w:val="18"/>
+          <w:szCs w:val="18"/>
+        </w:rPr>
+        <w:t xml:space="preserve">    environment:</w:t>
+      </w:r>
+    </w:p>
+    <w:p>
+      <w:r>
+        <w:rPr>
+          <w:rFonts w:ascii="Consolas" w:eastAsia="Consolas" w:hAnsi="Consolas" w:cs="Consolas"/>
+          <w:sz w:val="18"/>
+          <w:szCs w:val="18"/>
+        </w:rPr>
+        <w:t xml:space="preserve">      - GF_SECURITY_ADMIN_USER=admin</w:t>
+      </w:r>
+    </w:p>
+    <w:p>
+      <w:r>
+        <w:rPr>
+          <w:rFonts w:ascii="Consolas" w:eastAsia="Consolas" w:hAnsi="Consolas" w:cs="Consolas"/>
+          <w:sz w:val="18"/>
+          <w:szCs w:val="18"/>
+        </w:rPr>
+        <w:t xml:space="preserve">      - GF_SECURITY_ADMIN_PASSWORD=admin123  # CREDENCIAL DE LABORATORIO</w:t>
+      </w:r>
+    </w:p>
+    <w:p>
+      <w:pPr>
+        <w:rPr>
+          <w:u w:val="single"/>
+        </w:rPr>
+      </w:pPr>
+      <w:r>
+        <w:rPr>
+          <w:rFonts w:ascii="Consolas" w:eastAsia="Consolas" w:hAnsi="Consolas" w:cs="Consolas"/>
+          <w:sz w:val="18"/>
+          <w:szCs w:val="18"/>
+        </w:rPr>
+        <w:t xml:space="preserve">      - GF_DEFAULT_LOCALE=en-US</w:t>
       </w:r>
     </w:p>
     <w:p>
@@ -22281,7 +23296,17 @@
           <w:sz w:val="18"/>
           <w:szCs w:val="18"/>
         </w:rPr>
-        <w:t xml:space="preserve">      - elasticsearch_data:/usr/share/elasticsearch/data</w:t>
+        <w:t xml:space="preserve">      - ./grafana:/etc/grafana/provisioning</w:t>
+      </w:r>
+    </w:p>
+    <w:p>
+      <w:r>
+        <w:rPr>
+          <w:rFonts w:ascii="Consolas" w:eastAsia="Consolas" w:hAnsi="Consolas" w:cs="Consolas"/>
+          <w:sz w:val="18"/>
+          <w:szCs w:val="18"/>
+        </w:rPr>
+        <w:t xml:space="preserve">      - grafana_data:/var/lib/grafana</w:t>
       </w:r>
     </w:p>
     <w:p>
@@ -22311,6 +23336,36 @@
           <w:sz w:val="18"/>
           <w:szCs w:val="18"/>
         </w:rPr>
+        <w:t xml:space="preserve">    depends_on:</w:t>
+      </w:r>
+    </w:p>
+    <w:p>
+      <w:r>
+        <w:rPr>
+          <w:rFonts w:ascii="Consolas" w:eastAsia="Consolas" w:hAnsi="Consolas" w:cs="Consolas"/>
+          <w:sz w:val="18"/>
+          <w:szCs w:val="18"/>
+        </w:rPr>
+        <w:t xml:space="preserve">      - postgres</w:t>
+      </w:r>
+    </w:p>
+    <w:p>
+      <w:r>
+        <w:rPr>
+          <w:rFonts w:ascii="Consolas" w:eastAsia="Consolas" w:hAnsi="Consolas" w:cs="Consolas"/>
+          <w:sz w:val="18"/>
+          <w:szCs w:val="18"/>
+        </w:rPr>
+        <w:t xml:space="preserve">      - elasticsearch</w:t>
+      </w:r>
+    </w:p>
+    <w:p>
+      <w:r>
+        <w:rPr>
+          <w:rFonts w:ascii="Consolas" w:eastAsia="Consolas" w:hAnsi="Consolas" w:cs="Consolas"/>
+          <w:sz w:val="18"/>
+          <w:szCs w:val="18"/>
+        </w:rPr>
         <w:t xml:space="preserve">    restart: unless-stopped</w:t>
       </w:r>
     </w:p>
@@ -22331,117 +23386,27 @@
           <w:sz w:val="18"/>
           <w:szCs w:val="18"/>
         </w:rPr>
-        <w:t xml:space="preserve">  kibana:</w:t>
-      </w:r>
-    </w:p>
-    <w:p>
-      <w:r>
-        <w:rPr>
-          <w:rFonts w:ascii="Consolas" w:eastAsia="Consolas" w:hAnsi="Consolas" w:cs="Consolas"/>
-          <w:sz w:val="18"/>
-          <w:szCs w:val="18"/>
-        </w:rPr>
-        <w:t xml:space="preserve">    image: docker.elastic.co/kibana/kibana:8.15.0</w:t>
-      </w:r>
-    </w:p>
-    <w:p>
-      <w:r>
-        <w:rPr>
-          <w:rFonts w:ascii="Consolas" w:eastAsia="Consolas" w:hAnsi="Consolas" w:cs="Consolas"/>
-          <w:sz w:val="18"/>
-          <w:szCs w:val="18"/>
-        </w:rPr>
-        <w:t xml:space="preserve">    container_name: siem_kibana</w:t>
-      </w:r>
-    </w:p>
-    <w:p>
-      <w:r>
-        <w:rPr>
-          <w:rFonts w:ascii="Consolas" w:eastAsia="Consolas" w:hAnsi="Consolas" w:cs="Consolas"/>
-          <w:sz w:val="18"/>
-          <w:szCs w:val="18"/>
-        </w:rPr>
-        <w:t xml:space="preserve">    environment:</w:t>
-      </w:r>
-    </w:p>
-    <w:p>
-      <w:r>
-        <w:rPr>
-          <w:rFonts w:ascii="Consolas" w:eastAsia="Consolas" w:hAnsi="Consolas" w:cs="Consolas"/>
-          <w:sz w:val="18"/>
-          <w:szCs w:val="18"/>
-        </w:rPr>
-        <w:t xml:space="preserve">      - ELASTICSEARCH_HOSTS=http://elasticsearch:9200</w:t>
-      </w:r>
-    </w:p>
-    <w:p>
-      <w:r>
-        <w:rPr>
-          <w:rFonts w:ascii="Consolas" w:eastAsia="Consolas" w:hAnsi="Consolas" w:cs="Consolas"/>
-          <w:sz w:val="18"/>
-          <w:szCs w:val="18"/>
-        </w:rPr>
-        <w:t xml:space="preserve">    ports:</w:t>
-      </w:r>
-    </w:p>
-    <w:p>
-      <w:r>
-        <w:rPr>
-          <w:rFonts w:ascii="Consolas" w:eastAsia="Consolas" w:hAnsi="Consolas" w:cs="Consolas"/>
-          <w:sz w:val="18"/>
-          <w:szCs w:val="18"/>
-        </w:rPr>
-        <w:t xml:space="preserve">      - "5601:5601"</w:t>
-      </w:r>
-    </w:p>
-    <w:p>
-      <w:r>
-        <w:rPr>
-          <w:rFonts w:ascii="Consolas" w:eastAsia="Consolas" w:hAnsi="Consolas" w:cs="Consolas"/>
-          <w:sz w:val="18"/>
-          <w:szCs w:val="18"/>
-        </w:rPr>
-        <w:t xml:space="preserve">    networks:</w:t>
-      </w:r>
-    </w:p>
-    <w:p>
-      <w:r>
-        <w:rPr>
-          <w:rFonts w:ascii="Consolas" w:eastAsia="Consolas" w:hAnsi="Consolas" w:cs="Consolas"/>
-          <w:sz w:val="18"/>
-          <w:szCs w:val="18"/>
-        </w:rPr>
-        <w:t xml:space="preserve">      - siem-net</w:t>
-      </w:r>
-    </w:p>
-    <w:p>
-      <w:r>
-        <w:rPr>
-          <w:rFonts w:ascii="Consolas" w:eastAsia="Consolas" w:hAnsi="Consolas" w:cs="Consolas"/>
-          <w:sz w:val="18"/>
-          <w:szCs w:val="18"/>
-        </w:rPr>
-        <w:t xml:space="preserve">    depends_on:</w:t>
-      </w:r>
-    </w:p>
-    <w:p>
-      <w:r>
-        <w:rPr>
-          <w:rFonts w:ascii="Consolas" w:eastAsia="Consolas" w:hAnsi="Consolas" w:cs="Consolas"/>
-          <w:sz w:val="18"/>
-          <w:szCs w:val="18"/>
-        </w:rPr>
-        <w:t xml:space="preserve">      - elasticsearch</w:t>
-      </w:r>
-    </w:p>
-    <w:p>
-      <w:r>
-        <w:rPr>
-          <w:rFonts w:ascii="Consolas" w:eastAsia="Consolas" w:hAnsi="Consolas" w:cs="Consolas"/>
-          <w:sz w:val="18"/>
-          <w:szCs w:val="18"/>
-        </w:rPr>
-        <w:t xml:space="preserve">    restart: unless-stopped</w:t>
+        <w:t>networks:</w:t>
+      </w:r>
+    </w:p>
+    <w:p>
+      <w:r>
+        <w:rPr>
+          <w:rFonts w:ascii="Consolas" w:eastAsia="Consolas" w:hAnsi="Consolas" w:cs="Consolas"/>
+          <w:sz w:val="18"/>
+          <w:szCs w:val="18"/>
+        </w:rPr>
+        <w:t xml:space="preserve">  siem-net:</w:t>
+      </w:r>
+    </w:p>
+    <w:p>
+      <w:r>
+        <w:rPr>
+          <w:rFonts w:ascii="Consolas" w:eastAsia="Consolas" w:hAnsi="Consolas" w:cs="Consolas"/>
+          <w:sz w:val="18"/>
+          <w:szCs w:val="18"/>
+        </w:rPr>
+        <w:t xml:space="preserve">    driver: bridge</w:t>
       </w:r>
     </w:p>
     <w:p>
@@ -22461,127 +23426,83 @@
           <w:sz w:val="18"/>
           <w:szCs w:val="18"/>
         </w:rPr>
-        <w:t xml:space="preserve">  logstash:</w:t>
-      </w:r>
-    </w:p>
-    <w:p>
-      <w:r>
-        <w:rPr>
-          <w:rFonts w:ascii="Consolas" w:eastAsia="Consolas" w:hAnsi="Consolas" w:cs="Consolas"/>
-          <w:sz w:val="18"/>
-          <w:szCs w:val="18"/>
-        </w:rPr>
-        <w:t xml:space="preserve">    image: docker.elastic.co/logstash/logstash:8.15.0</w:t>
-      </w:r>
-    </w:p>
-    <w:p>
-      <w:r>
-        <w:rPr>
-          <w:rFonts w:ascii="Consolas" w:eastAsia="Consolas" w:hAnsi="Consolas" w:cs="Consolas"/>
-          <w:sz w:val="18"/>
-          <w:szCs w:val="18"/>
-        </w:rPr>
-        <w:t xml:space="preserve">    container_name: siem_logstash</w:t>
-      </w:r>
-    </w:p>
-    <w:p>
-      <w:r>
-        <w:rPr>
-          <w:rFonts w:ascii="Consolas" w:eastAsia="Consolas" w:hAnsi="Consolas" w:cs="Consolas"/>
-          <w:sz w:val="18"/>
-          <w:szCs w:val="18"/>
-        </w:rPr>
-        <w:t xml:space="preserve">    volumes:</w:t>
-      </w:r>
-    </w:p>
-    <w:p>
-      <w:r>
-        <w:rPr>
-          <w:rFonts w:ascii="Consolas" w:eastAsia="Consolas" w:hAnsi="Consolas" w:cs="Consolas"/>
-          <w:sz w:val="18"/>
-          <w:szCs w:val="18"/>
-        </w:rPr>
-        <w:t xml:space="preserve">      - ./logstash/logstash.conf:/usr/share/logstash/pipeline/logstash.conf</w:t>
-      </w:r>
-    </w:p>
-    <w:p>
-      <w:r>
-        <w:rPr>
-          <w:rFonts w:ascii="Consolas" w:eastAsia="Consolas" w:hAnsi="Consolas" w:cs="Consolas"/>
-          <w:sz w:val="18"/>
-          <w:szCs w:val="18"/>
-        </w:rPr>
-        <w:t xml:space="preserve">    ports:</w:t>
-      </w:r>
-    </w:p>
-    <w:p>
-      <w:r>
-        <w:rPr>
-          <w:rFonts w:ascii="Consolas" w:eastAsia="Consolas" w:hAnsi="Consolas" w:cs="Consolas"/>
-          <w:sz w:val="18"/>
-          <w:szCs w:val="18"/>
-        </w:rPr>
-        <w:t xml:space="preserve">      - "5140:5140/udp"</w:t>
-      </w:r>
-    </w:p>
-    <w:p>
-      <w:r>
-        <w:rPr>
-          <w:rFonts w:ascii="Consolas" w:eastAsia="Consolas" w:hAnsi="Consolas" w:cs="Consolas"/>
-          <w:sz w:val="18"/>
-          <w:szCs w:val="18"/>
-        </w:rPr>
-        <w:t xml:space="preserve">    networks:</w:t>
-      </w:r>
-    </w:p>
-    <w:p>
-      <w:r>
-        <w:rPr>
-          <w:rFonts w:ascii="Consolas" w:eastAsia="Consolas" w:hAnsi="Consolas" w:cs="Consolas"/>
-          <w:sz w:val="18"/>
-          <w:szCs w:val="18"/>
-        </w:rPr>
-        <w:t xml:space="preserve">      - siem-net</w:t>
-      </w:r>
-    </w:p>
-    <w:p>
-      <w:r>
-        <w:rPr>
-          <w:rFonts w:ascii="Consolas" w:eastAsia="Consolas" w:hAnsi="Consolas" w:cs="Consolas"/>
-          <w:sz w:val="18"/>
-          <w:szCs w:val="18"/>
-        </w:rPr>
-        <w:t xml:space="preserve">    depends_on:</w:t>
-      </w:r>
-    </w:p>
-    <w:p>
-      <w:r>
-        <w:rPr>
-          <w:rFonts w:ascii="Consolas" w:eastAsia="Consolas" w:hAnsi="Consolas" w:cs="Consolas"/>
-          <w:sz w:val="18"/>
-          <w:szCs w:val="18"/>
-        </w:rPr>
-        <w:t xml:space="preserve">      - elasticsearch</w:t>
-      </w:r>
-    </w:p>
-    <w:p>
-      <w:r>
-        <w:rPr>
-          <w:rFonts w:ascii="Consolas" w:eastAsia="Consolas" w:hAnsi="Consolas" w:cs="Consolas"/>
-          <w:sz w:val="18"/>
-          <w:szCs w:val="18"/>
-        </w:rPr>
-        <w:t xml:space="preserve">      - postgres</w:t>
-      </w:r>
-    </w:p>
-    <w:p>
-      <w:r>
-        <w:rPr>
-          <w:rFonts w:ascii="Consolas" w:eastAsia="Consolas" w:hAnsi="Consolas" w:cs="Consolas"/>
-          <w:sz w:val="18"/>
-          <w:szCs w:val="18"/>
-        </w:rPr>
-        <w:t xml:space="preserve">    restart: unless-stopped</w:t>
+        <w:t>volumes:</w:t>
+      </w:r>
+    </w:p>
+    <w:p>
+      <w:r>
+        <w:rPr>
+          <w:rFonts w:ascii="Consolas" w:eastAsia="Consolas" w:hAnsi="Consolas" w:cs="Consolas"/>
+          <w:sz w:val="18"/>
+          <w:szCs w:val="18"/>
+        </w:rPr>
+        <w:t xml:space="preserve">  postgres_data:</w:t>
+      </w:r>
+    </w:p>
+    <w:p>
+      <w:r>
+        <w:rPr>
+          <w:rFonts w:ascii="Consolas" w:eastAsia="Consolas" w:hAnsi="Consolas" w:cs="Consolas"/>
+          <w:sz w:val="18"/>
+          <w:szCs w:val="18"/>
+        </w:rPr>
+        <w:t xml:space="preserve">  elasticsearch_data:</w:t>
+      </w:r>
+    </w:p>
+    <w:p>
+      <w:r>
+        <w:rPr>
+          <w:rFonts w:ascii="Consolas" w:eastAsia="Consolas" w:hAnsi="Consolas" w:cs="Consolas"/>
+          <w:sz w:val="18"/>
+          <w:szCs w:val="18"/>
+        </w:rPr>
+        <w:t xml:space="preserve">  n8n_data:</w:t>
+      </w:r>
+    </w:p>
+    <w:p>
+      <w:r>
+        <w:rPr>
+          <w:rFonts w:ascii="Consolas" w:eastAsia="Consolas" w:hAnsi="Consolas" w:cs="Consolas"/>
+          <w:sz w:val="18"/>
+          <w:szCs w:val="18"/>
+        </w:rPr>
+        <w:t xml:space="preserve">  grafana_data:</w:t>
+      </w:r>
+    </w:p>
+    <w:p>
+      <w:pPr>
+        <w:pStyle w:val="Ttulo2"/>
+      </w:pPr>
+      <w:bookmarkStart w:id="95" w:name="H0000049D"/>
+      <w:r>
+        <w:t>Anexo G — Configuración syslog-ng (syslog-ng/syslog-ng.conf)</w:t>
+      </w:r>
+      <w:bookmarkEnd w:id="95"/>
+    </w:p>
+    <w:p>
+      <w:r>
+        <w:lastRenderedPageBreak/>
+        <w:t>Configuración del recolector de logs: escucha en UDP/514 y reenvía todo el tráfico recibido a Logstash en UDP/5140, sin aplicar transformaciones.</w:t>
+      </w:r>
+    </w:p>
+    <w:p>
+      <w:r>
+        <w:rPr>
+          <w:rFonts w:ascii="Consolas" w:eastAsia="Consolas" w:hAnsi="Consolas" w:cs="Consolas"/>
+          <w:sz w:val="18"/>
+          <w:szCs w:val="18"/>
+        </w:rPr>
+        <w:t>@version: 4.8</w:t>
+      </w:r>
+    </w:p>
+    <w:p>
+      <w:r>
+        <w:rPr>
+          <w:rFonts w:ascii="Consolas" w:eastAsia="Consolas" w:hAnsi="Consolas" w:cs="Consolas"/>
+          <w:sz w:val="18"/>
+          <w:szCs w:val="18"/>
+        </w:rPr>
+        <w:t>@include "scl.conf"</w:t>
       </w:r>
     </w:p>
     <w:p>
@@ -22601,117 +23522,62 @@
           <w:sz w:val="18"/>
           <w:szCs w:val="18"/>
         </w:rPr>
-        <w:t xml:space="preserve">  syslog-ng:</w:t>
-      </w:r>
-    </w:p>
-    <w:p>
-      <w:r>
-        <w:rPr>
-          <w:rFonts w:ascii="Consolas" w:eastAsia="Consolas" w:hAnsi="Consolas" w:cs="Consolas"/>
-          <w:sz w:val="18"/>
-          <w:szCs w:val="18"/>
-        </w:rPr>
-        <w:t xml:space="preserve">    image: balabit/syslog-ng:4.8.0</w:t>
-      </w:r>
-    </w:p>
-    <w:p>
-      <w:r>
-        <w:rPr>
-          <w:rFonts w:ascii="Consolas" w:eastAsia="Consolas" w:hAnsi="Consolas" w:cs="Consolas"/>
-          <w:sz w:val="18"/>
-          <w:szCs w:val="18"/>
-        </w:rPr>
-        <w:t xml:space="preserve">    container_name: siem_syslog</w:t>
-      </w:r>
-    </w:p>
-    <w:p>
-      <w:r>
-        <w:rPr>
-          <w:rFonts w:ascii="Consolas" w:eastAsia="Consolas" w:hAnsi="Consolas" w:cs="Consolas"/>
-          <w:sz w:val="18"/>
-          <w:szCs w:val="18"/>
-        </w:rPr>
-        <w:t xml:space="preserve">    volumes:</w:t>
-      </w:r>
-    </w:p>
-    <w:p>
-      <w:r>
-        <w:rPr>
-          <w:rFonts w:ascii="Consolas" w:eastAsia="Consolas" w:hAnsi="Consolas" w:cs="Consolas"/>
-          <w:sz w:val="18"/>
-          <w:szCs w:val="18"/>
-        </w:rPr>
-        <w:t xml:space="preserve">      - ./syslog-ng/syslog-ng.conf:/etc/syslog-ng/syslog-ng.conf</w:t>
-      </w:r>
-    </w:p>
-    <w:p>
-      <w:r>
-        <w:rPr>
-          <w:rFonts w:ascii="Consolas" w:eastAsia="Consolas" w:hAnsi="Consolas" w:cs="Consolas"/>
-          <w:sz w:val="18"/>
-          <w:szCs w:val="18"/>
-        </w:rPr>
-        <w:t xml:space="preserve">    ports:</w:t>
-      </w:r>
-    </w:p>
-    <w:p>
-      <w:r>
-        <w:rPr>
-          <w:rFonts w:ascii="Consolas" w:eastAsia="Consolas" w:hAnsi="Consolas" w:cs="Consolas"/>
-          <w:sz w:val="18"/>
-          <w:szCs w:val="18"/>
-        </w:rPr>
-        <w:t xml:space="preserve">      - "514:514/udp"</w:t>
-      </w:r>
-    </w:p>
-    <w:p>
-      <w:r>
-        <w:rPr>
-          <w:rFonts w:ascii="Consolas" w:eastAsia="Consolas" w:hAnsi="Consolas" w:cs="Consolas"/>
-          <w:sz w:val="18"/>
-          <w:szCs w:val="18"/>
-        </w:rPr>
-        <w:t xml:space="preserve">    networks:</w:t>
-      </w:r>
-    </w:p>
-    <w:p>
-      <w:r>
-        <w:rPr>
-          <w:rFonts w:ascii="Consolas" w:eastAsia="Consolas" w:hAnsi="Consolas" w:cs="Consolas"/>
-          <w:sz w:val="18"/>
-          <w:szCs w:val="18"/>
-        </w:rPr>
-        <w:t xml:space="preserve">      - siem-net</w:t>
-      </w:r>
-    </w:p>
-    <w:p>
-      <w:r>
-        <w:rPr>
-          <w:rFonts w:ascii="Consolas" w:eastAsia="Consolas" w:hAnsi="Consolas" w:cs="Consolas"/>
-          <w:sz w:val="18"/>
-          <w:szCs w:val="18"/>
-        </w:rPr>
-        <w:t xml:space="preserve">    depends_on:</w:t>
-      </w:r>
-    </w:p>
-    <w:p>
-      <w:r>
-        <w:rPr>
-          <w:rFonts w:ascii="Consolas" w:eastAsia="Consolas" w:hAnsi="Consolas" w:cs="Consolas"/>
-          <w:sz w:val="18"/>
-          <w:szCs w:val="18"/>
-        </w:rPr>
-        <w:t xml:space="preserve">      - logstash</w:t>
-      </w:r>
-    </w:p>
-    <w:p>
-      <w:r>
-        <w:rPr>
-          <w:rFonts w:ascii="Consolas" w:eastAsia="Consolas" w:hAnsi="Consolas" w:cs="Consolas"/>
-          <w:sz w:val="18"/>
-          <w:szCs w:val="18"/>
-        </w:rPr>
-        <w:t xml:space="preserve">    restart: unless-stopped</w:t>
+        <w:t>source s_network {</w:t>
+      </w:r>
+    </w:p>
+    <w:p>
+      <w:r>
+        <w:rPr>
+          <w:rFonts w:ascii="Consolas" w:eastAsia="Consolas" w:hAnsi="Consolas" w:cs="Consolas"/>
+          <w:sz w:val="18"/>
+          <w:szCs w:val="18"/>
+        </w:rPr>
+        <w:t xml:space="preserve">  network(</w:t>
+      </w:r>
+    </w:p>
+    <w:p>
+      <w:r>
+        <w:rPr>
+          <w:rFonts w:ascii="Consolas" w:eastAsia="Consolas" w:hAnsi="Consolas" w:cs="Consolas"/>
+          <w:sz w:val="18"/>
+          <w:szCs w:val="18"/>
+        </w:rPr>
+        <w:t xml:space="preserve">    transport("udp")</w:t>
+      </w:r>
+    </w:p>
+    <w:p>
+      <w:r>
+        <w:rPr>
+          <w:rFonts w:ascii="Consolas" w:eastAsia="Consolas" w:hAnsi="Consolas" w:cs="Consolas"/>
+          <w:sz w:val="18"/>
+          <w:szCs w:val="18"/>
+        </w:rPr>
+        <w:t xml:space="preserve">    port(514)</w:t>
+      </w:r>
+    </w:p>
+    <w:p>
+      <w:pPr>
+        <w:rPr>
+          <w:u w:val="single"/>
+        </w:rPr>
+      </w:pPr>
+      <w:r>
+        <w:rPr>
+          <w:rFonts w:ascii="Consolas" w:eastAsia="Consolas" w:hAnsi="Consolas" w:cs="Consolas"/>
+          <w:sz w:val="18"/>
+          <w:szCs w:val="18"/>
+        </w:rPr>
+        <w:t xml:space="preserve">  );</w:t>
+      </w:r>
+    </w:p>
+    <w:p>
+      <w:r>
+        <w:rPr>
+          <w:rFonts w:ascii="Consolas" w:eastAsia="Consolas" w:hAnsi="Consolas" w:cs="Consolas"/>
+          <w:sz w:val="18"/>
+          <w:szCs w:val="18"/>
+        </w:rPr>
+        <w:t>};</w:t>
       </w:r>
     </w:p>
     <w:p>
@@ -22731,801 +23597,6 @@
           <w:sz w:val="18"/>
           <w:szCs w:val="18"/>
         </w:rPr>
-        <w:t xml:space="preserve">  n8n:</w:t>
-      </w:r>
-    </w:p>
-    <w:p>
-      <w:r>
-        <w:rPr>
-          <w:rFonts w:ascii="Consolas" w:eastAsia="Consolas" w:hAnsi="Consolas" w:cs="Consolas"/>
-          <w:sz w:val="18"/>
-          <w:szCs w:val="18"/>
-        </w:rPr>
-        <w:t xml:space="preserve">    image: n8nio/n8n:2.1.5</w:t>
-      </w:r>
-    </w:p>
-    <w:p>
-      <w:r>
-        <w:rPr>
-          <w:rFonts w:ascii="Consolas" w:eastAsia="Consolas" w:hAnsi="Consolas" w:cs="Consolas"/>
-          <w:sz w:val="18"/>
-          <w:szCs w:val="18"/>
-        </w:rPr>
-        <w:t xml:space="preserve">    container_name: siem_n8n</w:t>
-      </w:r>
-    </w:p>
-    <w:p>
-      <w:pPr>
-        <w:rPr>
-          <w:u w:val="single"/>
-        </w:rPr>
-      </w:pPr>
-      <w:r>
-        <w:rPr>
-          <w:rFonts w:ascii="Consolas" w:eastAsia="Consolas" w:hAnsi="Consolas" w:cs="Consolas"/>
-          <w:sz w:val="18"/>
-          <w:szCs w:val="18"/>
-        </w:rPr>
-        <w:t xml:space="preserve">    ports:</w:t>
-      </w:r>
-    </w:p>
-    <w:p>
-      <w:r>
-        <w:rPr>
-          <w:rFonts w:ascii="Consolas" w:eastAsia="Consolas" w:hAnsi="Consolas" w:cs="Consolas"/>
-          <w:sz w:val="18"/>
-          <w:szCs w:val="18"/>
-        </w:rPr>
-        <w:t xml:space="preserve">      - "5678:5678"</w:t>
-      </w:r>
-    </w:p>
-    <w:p>
-      <w:r>
-        <w:rPr>
-          <w:rFonts w:ascii="Consolas" w:eastAsia="Consolas" w:hAnsi="Consolas" w:cs="Consolas"/>
-          <w:sz w:val="18"/>
-          <w:szCs w:val="18"/>
-        </w:rPr>
-        <w:t xml:space="preserve">    environment:</w:t>
-      </w:r>
-    </w:p>
-    <w:p>
-      <w:r>
-        <w:rPr>
-          <w:rFonts w:ascii="Consolas" w:eastAsia="Consolas" w:hAnsi="Consolas" w:cs="Consolas"/>
-          <w:sz w:val="18"/>
-          <w:szCs w:val="18"/>
-        </w:rPr>
-        <w:t xml:space="preserve">      - DB_TYPE=postgresdb</w:t>
-      </w:r>
-    </w:p>
-    <w:p>
-      <w:r>
-        <w:rPr>
-          <w:rFonts w:ascii="Consolas" w:eastAsia="Consolas" w:hAnsi="Consolas" w:cs="Consolas"/>
-          <w:sz w:val="18"/>
-          <w:szCs w:val="18"/>
-        </w:rPr>
-        <w:t xml:space="preserve">      - DB_POSTGRESDB_HOST=postgres</w:t>
-      </w:r>
-    </w:p>
-    <w:p>
-      <w:r>
-        <w:rPr>
-          <w:rFonts w:ascii="Consolas" w:eastAsia="Consolas" w:hAnsi="Consolas" w:cs="Consolas"/>
-          <w:sz w:val="18"/>
-          <w:szCs w:val="18"/>
-        </w:rPr>
-        <w:t xml:space="preserve">      - DB_POSTGRESDB_PORT=5432</w:t>
-      </w:r>
-    </w:p>
-    <w:p>
-      <w:r>
-        <w:rPr>
-          <w:rFonts w:ascii="Consolas" w:eastAsia="Consolas" w:hAnsi="Consolas" w:cs="Consolas"/>
-          <w:sz w:val="18"/>
-          <w:szCs w:val="18"/>
-        </w:rPr>
-        <w:t xml:space="preserve">      - DB_POSTGRESDB_DATABASE=siem</w:t>
-      </w:r>
-    </w:p>
-    <w:p>
-      <w:r>
-        <w:rPr>
-          <w:rFonts w:ascii="Consolas" w:eastAsia="Consolas" w:hAnsi="Consolas" w:cs="Consolas"/>
-          <w:sz w:val="18"/>
-          <w:szCs w:val="18"/>
-        </w:rPr>
-        <w:t xml:space="preserve">      - DB_POSTGRESDB_USER=siem</w:t>
-      </w:r>
-    </w:p>
-    <w:p>
-      <w:pPr>
-        <w:rPr>
-          <w:rFonts w:ascii="Consolas" w:eastAsia="Consolas" w:hAnsi="Consolas" w:cs="Consolas"/>
-          <w:sz w:val="18"/>
-          <w:szCs w:val="18"/>
-        </w:rPr>
-      </w:pPr>
-      <w:r>
-        <w:rPr>
-          <w:rFonts w:ascii="Consolas" w:eastAsia="Consolas" w:hAnsi="Consolas" w:cs="Consolas"/>
-          <w:sz w:val="18"/>
-          <w:szCs w:val="18"/>
-        </w:rPr>
-        <w:t xml:space="preserve">      - DB_POSTGRESDB_PASSWORD=siem123</w:t>
-      </w:r>
-    </w:p>
-    <w:p/>
-    <w:p>
-      <w:r>
-        <w:rPr>
-          <w:rFonts w:ascii="Consolas" w:eastAsia="Consolas" w:hAnsi="Consolas" w:cs="Consolas"/>
-          <w:sz w:val="18"/>
-          <w:szCs w:val="18"/>
-        </w:rPr>
-        <w:t xml:space="preserve">    volumes:</w:t>
-      </w:r>
-    </w:p>
-    <w:p>
-      <w:r>
-        <w:rPr>
-          <w:rFonts w:ascii="Consolas" w:eastAsia="Consolas" w:hAnsi="Consolas" w:cs="Consolas"/>
-          <w:sz w:val="18"/>
-          <w:szCs w:val="18"/>
-        </w:rPr>
-        <w:t xml:space="preserve">      - n8n_data:/home/node/.n8n</w:t>
-      </w:r>
-    </w:p>
-    <w:p>
-      <w:r>
-        <w:rPr>
-          <w:rFonts w:ascii="Consolas" w:eastAsia="Consolas" w:hAnsi="Consolas" w:cs="Consolas"/>
-          <w:sz w:val="18"/>
-          <w:szCs w:val="18"/>
-        </w:rPr>
-        <w:t xml:space="preserve">    networks:</w:t>
-      </w:r>
-    </w:p>
-    <w:p>
-      <w:r>
-        <w:rPr>
-          <w:rFonts w:ascii="Consolas" w:eastAsia="Consolas" w:hAnsi="Consolas" w:cs="Consolas"/>
-          <w:sz w:val="18"/>
-          <w:szCs w:val="18"/>
-        </w:rPr>
-        <w:t xml:space="preserve">      - siem-net</w:t>
-      </w:r>
-    </w:p>
-    <w:p>
-      <w:r>
-        <w:rPr>
-          <w:rFonts w:ascii="Consolas" w:eastAsia="Consolas" w:hAnsi="Consolas" w:cs="Consolas"/>
-          <w:sz w:val="18"/>
-          <w:szCs w:val="18"/>
-        </w:rPr>
-        <w:lastRenderedPageBreak/>
-        <w:t xml:space="preserve">    depends_on:</w:t>
-      </w:r>
-    </w:p>
-    <w:p>
-      <w:r>
-        <w:rPr>
-          <w:rFonts w:ascii="Consolas" w:eastAsia="Consolas" w:hAnsi="Consolas" w:cs="Consolas"/>
-          <w:sz w:val="18"/>
-          <w:szCs w:val="18"/>
-        </w:rPr>
-        <w:t xml:space="preserve">      - postgres</w:t>
-      </w:r>
-    </w:p>
-    <w:p>
-      <w:r>
-        <w:rPr>
-          <w:rFonts w:ascii="Consolas" w:eastAsia="Consolas" w:hAnsi="Consolas" w:cs="Consolas"/>
-          <w:sz w:val="18"/>
-          <w:szCs w:val="18"/>
-        </w:rPr>
-        <w:t xml:space="preserve">    restart: unless-stopped</w:t>
-      </w:r>
-    </w:p>
-    <w:p>
-      <w:r>
-        <w:rPr>
-          <w:rFonts w:ascii="Consolas" w:eastAsia="Consolas" w:hAnsi="Consolas" w:cs="Consolas"/>
-          <w:sz w:val="18"/>
-          <w:szCs w:val="18"/>
-        </w:rPr>
-        <w:t xml:space="preserve"> </w:t>
-      </w:r>
-    </w:p>
-    <w:p>
-      <w:r>
-        <w:rPr>
-          <w:rFonts w:ascii="Consolas" w:eastAsia="Consolas" w:hAnsi="Consolas" w:cs="Consolas"/>
-          <w:sz w:val="18"/>
-          <w:szCs w:val="18"/>
-        </w:rPr>
-        <w:t xml:space="preserve">  dashboard:</w:t>
-      </w:r>
-    </w:p>
-    <w:p>
-      <w:r>
-        <w:rPr>
-          <w:rFonts w:ascii="Consolas" w:eastAsia="Consolas" w:hAnsi="Consolas" w:cs="Consolas"/>
-          <w:sz w:val="18"/>
-          <w:szCs w:val="18"/>
-        </w:rPr>
-        <w:t xml:space="preserve">    build: ./dashboard</w:t>
-      </w:r>
-    </w:p>
-    <w:p>
-      <w:r>
-        <w:rPr>
-          <w:rFonts w:ascii="Consolas" w:eastAsia="Consolas" w:hAnsi="Consolas" w:cs="Consolas"/>
-          <w:sz w:val="18"/>
-          <w:szCs w:val="18"/>
-        </w:rPr>
-        <w:t xml:space="preserve">    container_name: siem_dashboard</w:t>
-      </w:r>
-    </w:p>
-    <w:p>
-      <w:r>
-        <w:rPr>
-          <w:rFonts w:ascii="Consolas" w:eastAsia="Consolas" w:hAnsi="Consolas" w:cs="Consolas"/>
-          <w:sz w:val="18"/>
-          <w:szCs w:val="18"/>
-        </w:rPr>
-        <w:t xml:space="preserve">    ports:</w:t>
-      </w:r>
-    </w:p>
-    <w:p>
-      <w:r>
-        <w:rPr>
-          <w:rFonts w:ascii="Consolas" w:eastAsia="Consolas" w:hAnsi="Consolas" w:cs="Consolas"/>
-          <w:sz w:val="18"/>
-          <w:szCs w:val="18"/>
-        </w:rPr>
-        <w:t xml:space="preserve">      - "8501:8501"</w:t>
-      </w:r>
-    </w:p>
-    <w:p>
-      <w:r>
-        <w:rPr>
-          <w:rFonts w:ascii="Consolas" w:eastAsia="Consolas" w:hAnsi="Consolas" w:cs="Consolas"/>
-          <w:sz w:val="18"/>
-          <w:szCs w:val="18"/>
-        </w:rPr>
-        <w:t xml:space="preserve">    environment:</w:t>
-      </w:r>
-    </w:p>
-    <w:p>
-      <w:r>
-        <w:rPr>
-          <w:rFonts w:ascii="Consolas" w:eastAsia="Consolas" w:hAnsi="Consolas" w:cs="Consolas"/>
-          <w:sz w:val="18"/>
-          <w:szCs w:val="18"/>
-        </w:rPr>
-        <w:t xml:space="preserve">      - DB_HOST=postgres</w:t>
-      </w:r>
-    </w:p>
-    <w:p>
-      <w:r>
-        <w:rPr>
-          <w:rFonts w:ascii="Consolas" w:eastAsia="Consolas" w:hAnsi="Consolas" w:cs="Consolas"/>
-          <w:sz w:val="18"/>
-          <w:szCs w:val="18"/>
-        </w:rPr>
-        <w:t xml:space="preserve">      - DB_PORT=5432</w:t>
-      </w:r>
-    </w:p>
-    <w:p>
-      <w:r>
-        <w:rPr>
-          <w:rFonts w:ascii="Consolas" w:eastAsia="Consolas" w:hAnsi="Consolas" w:cs="Consolas"/>
-          <w:sz w:val="18"/>
-          <w:szCs w:val="18"/>
-        </w:rPr>
-        <w:t xml:space="preserve">      - DB_NAME=siem</w:t>
-      </w:r>
-    </w:p>
-    <w:p>
-      <w:r>
-        <w:rPr>
-          <w:rFonts w:ascii="Consolas" w:eastAsia="Consolas" w:hAnsi="Consolas" w:cs="Consolas"/>
-          <w:sz w:val="18"/>
-          <w:szCs w:val="18"/>
-        </w:rPr>
-        <w:t xml:space="preserve">      - DB_USER=siem</w:t>
-      </w:r>
-    </w:p>
-    <w:p>
-      <w:r>
-        <w:rPr>
-          <w:rFonts w:ascii="Consolas" w:eastAsia="Consolas" w:hAnsi="Consolas" w:cs="Consolas"/>
-          <w:sz w:val="18"/>
-          <w:szCs w:val="18"/>
-        </w:rPr>
-        <w:t xml:space="preserve">      - DB_PASSWORD=siem123</w:t>
-      </w:r>
-    </w:p>
-    <w:p>
-      <w:r>
-        <w:rPr>
-          <w:rFonts w:ascii="Consolas" w:eastAsia="Consolas" w:hAnsi="Consolas" w:cs="Consolas"/>
-          <w:sz w:val="18"/>
-          <w:szCs w:val="18"/>
-        </w:rPr>
-        <w:t xml:space="preserve">    networks:</w:t>
-      </w:r>
-    </w:p>
-    <w:p>
-      <w:r>
-        <w:rPr>
-          <w:rFonts w:ascii="Consolas" w:eastAsia="Consolas" w:hAnsi="Consolas" w:cs="Consolas"/>
-          <w:sz w:val="18"/>
-          <w:szCs w:val="18"/>
-        </w:rPr>
-        <w:t xml:space="preserve">      - siem-net</w:t>
-      </w:r>
-    </w:p>
-    <w:p>
-      <w:r>
-        <w:rPr>
-          <w:rFonts w:ascii="Consolas" w:eastAsia="Consolas" w:hAnsi="Consolas" w:cs="Consolas"/>
-          <w:sz w:val="18"/>
-          <w:szCs w:val="18"/>
-        </w:rPr>
-        <w:t xml:space="preserve">    depends_on:</w:t>
-      </w:r>
-    </w:p>
-    <w:p>
-      <w:r>
-        <w:rPr>
-          <w:rFonts w:ascii="Consolas" w:eastAsia="Consolas" w:hAnsi="Consolas" w:cs="Consolas"/>
-          <w:sz w:val="18"/>
-          <w:szCs w:val="18"/>
-        </w:rPr>
-        <w:t xml:space="preserve">      - postgres</w:t>
-      </w:r>
-    </w:p>
-    <w:p>
-      <w:r>
-        <w:rPr>
-          <w:rFonts w:ascii="Consolas" w:eastAsia="Consolas" w:hAnsi="Consolas" w:cs="Consolas"/>
-          <w:sz w:val="18"/>
-          <w:szCs w:val="18"/>
-        </w:rPr>
-        <w:t xml:space="preserve">    restart: unless-stopped</w:t>
-      </w:r>
-    </w:p>
-    <w:p>
-      <w:r>
-        <w:rPr>
-          <w:rFonts w:ascii="Consolas" w:eastAsia="Consolas" w:hAnsi="Consolas" w:cs="Consolas"/>
-          <w:sz w:val="18"/>
-          <w:szCs w:val="18"/>
-        </w:rPr>
-        <w:t xml:space="preserve"> </w:t>
-      </w:r>
-    </w:p>
-    <w:p>
-      <w:r>
-        <w:rPr>
-          <w:rFonts w:ascii="Consolas" w:eastAsia="Consolas" w:hAnsi="Consolas" w:cs="Consolas"/>
-          <w:sz w:val="18"/>
-          <w:szCs w:val="18"/>
-        </w:rPr>
-        <w:t xml:space="preserve">  grafana:</w:t>
-      </w:r>
-    </w:p>
-    <w:p>
-      <w:pPr>
-        <w:rPr>
-          <w:u w:val="single"/>
-        </w:rPr>
-      </w:pPr>
-      <w:r>
-        <w:rPr>
-          <w:rFonts w:ascii="Consolas" w:eastAsia="Consolas" w:hAnsi="Consolas" w:cs="Consolas"/>
-          <w:sz w:val="18"/>
-          <w:szCs w:val="18"/>
-        </w:rPr>
-        <w:t xml:space="preserve">    image: grafana/grafana:11.1.0</w:t>
-      </w:r>
-    </w:p>
-    <w:p>
-      <w:r>
-        <w:rPr>
-          <w:rFonts w:ascii="Consolas" w:eastAsia="Consolas" w:hAnsi="Consolas" w:cs="Consolas"/>
-          <w:sz w:val="18"/>
-          <w:szCs w:val="18"/>
-        </w:rPr>
-        <w:t xml:space="preserve">    container_name: siem_grafana</w:t>
-      </w:r>
-    </w:p>
-    <w:p>
-      <w:r>
-        <w:rPr>
-          <w:rFonts w:ascii="Consolas" w:eastAsia="Consolas" w:hAnsi="Consolas" w:cs="Consolas"/>
-          <w:sz w:val="18"/>
-          <w:szCs w:val="18"/>
-        </w:rPr>
-        <w:t xml:space="preserve">    ports:</w:t>
-      </w:r>
-    </w:p>
-    <w:p>
-      <w:r>
-        <w:rPr>
-          <w:rFonts w:ascii="Consolas" w:eastAsia="Consolas" w:hAnsi="Consolas" w:cs="Consolas"/>
-          <w:sz w:val="18"/>
-          <w:szCs w:val="18"/>
-        </w:rPr>
-        <w:t xml:space="preserve">      - "3000:3000"</w:t>
-      </w:r>
-    </w:p>
-    <w:p>
-      <w:r>
-        <w:rPr>
-          <w:rFonts w:ascii="Consolas" w:eastAsia="Consolas" w:hAnsi="Consolas" w:cs="Consolas"/>
-          <w:sz w:val="18"/>
-          <w:szCs w:val="18"/>
-        </w:rPr>
-        <w:t xml:space="preserve">    environment:</w:t>
-      </w:r>
-    </w:p>
-    <w:p>
-      <w:r>
-        <w:rPr>
-          <w:rFonts w:ascii="Consolas" w:eastAsia="Consolas" w:hAnsi="Consolas" w:cs="Consolas"/>
-          <w:sz w:val="18"/>
-          <w:szCs w:val="18"/>
-        </w:rPr>
-        <w:t xml:space="preserve">      - GF_SECURITY_ADMIN_USER=admin</w:t>
-      </w:r>
-    </w:p>
-    <w:p>
-      <w:r>
-        <w:rPr>
-          <w:rFonts w:ascii="Consolas" w:eastAsia="Consolas" w:hAnsi="Consolas" w:cs="Consolas"/>
-          <w:sz w:val="18"/>
-          <w:szCs w:val="18"/>
-        </w:rPr>
-        <w:t xml:space="preserve">      - GF_SECURITY_ADMIN_PASSWORD=admin123</w:t>
-      </w:r>
-    </w:p>
-    <w:p>
-      <w:pPr>
-        <w:rPr>
-          <w:u w:val="single"/>
-        </w:rPr>
-      </w:pPr>
-      <w:r>
-        <w:rPr>
-          <w:rFonts w:ascii="Consolas" w:eastAsia="Consolas" w:hAnsi="Consolas" w:cs="Consolas"/>
-          <w:sz w:val="18"/>
-          <w:szCs w:val="18"/>
-        </w:rPr>
-        <w:t xml:space="preserve">      - GF_DEFAULT_LOCALE=en-US</w:t>
-      </w:r>
-    </w:p>
-    <w:p>
-      <w:r>
-        <w:rPr>
-          <w:rFonts w:ascii="Consolas" w:eastAsia="Consolas" w:hAnsi="Consolas" w:cs="Consolas"/>
-          <w:sz w:val="18"/>
-          <w:szCs w:val="18"/>
-        </w:rPr>
-        <w:t xml:space="preserve">    volumes:</w:t>
-      </w:r>
-    </w:p>
-    <w:p>
-      <w:r>
-        <w:rPr>
-          <w:rFonts w:ascii="Consolas" w:eastAsia="Consolas" w:hAnsi="Consolas" w:cs="Consolas"/>
-          <w:sz w:val="18"/>
-          <w:szCs w:val="18"/>
-        </w:rPr>
-        <w:t xml:space="preserve">      - ./grafana:/etc/grafana/provisioning</w:t>
-      </w:r>
-    </w:p>
-    <w:p>
-      <w:r>
-        <w:rPr>
-          <w:rFonts w:ascii="Consolas" w:eastAsia="Consolas" w:hAnsi="Consolas" w:cs="Consolas"/>
-          <w:sz w:val="18"/>
-          <w:szCs w:val="18"/>
-        </w:rPr>
-        <w:t xml:space="preserve">      - grafana_data:/var/lib/grafana</w:t>
-      </w:r>
-    </w:p>
-    <w:p>
-      <w:r>
-        <w:rPr>
-          <w:rFonts w:ascii="Consolas" w:eastAsia="Consolas" w:hAnsi="Consolas" w:cs="Consolas"/>
-          <w:sz w:val="18"/>
-          <w:szCs w:val="18"/>
-        </w:rPr>
-        <w:t xml:space="preserve">    networks:</w:t>
-      </w:r>
-    </w:p>
-    <w:p>
-      <w:r>
-        <w:rPr>
-          <w:rFonts w:ascii="Consolas" w:eastAsia="Consolas" w:hAnsi="Consolas" w:cs="Consolas"/>
-          <w:sz w:val="18"/>
-          <w:szCs w:val="18"/>
-        </w:rPr>
-        <w:t xml:space="preserve">      - siem-net</w:t>
-      </w:r>
-    </w:p>
-    <w:p>
-      <w:r>
-        <w:rPr>
-          <w:rFonts w:ascii="Consolas" w:eastAsia="Consolas" w:hAnsi="Consolas" w:cs="Consolas"/>
-          <w:sz w:val="18"/>
-          <w:szCs w:val="18"/>
-        </w:rPr>
-        <w:t xml:space="preserve">    depends_on:</w:t>
-      </w:r>
-    </w:p>
-    <w:p>
-      <w:r>
-        <w:rPr>
-          <w:rFonts w:ascii="Consolas" w:eastAsia="Consolas" w:hAnsi="Consolas" w:cs="Consolas"/>
-          <w:sz w:val="18"/>
-          <w:szCs w:val="18"/>
-        </w:rPr>
-        <w:t xml:space="preserve">      - postgres</w:t>
-      </w:r>
-    </w:p>
-    <w:p>
-      <w:r>
-        <w:rPr>
-          <w:rFonts w:ascii="Consolas" w:eastAsia="Consolas" w:hAnsi="Consolas" w:cs="Consolas"/>
-          <w:sz w:val="18"/>
-          <w:szCs w:val="18"/>
-        </w:rPr>
-        <w:t xml:space="preserve">      - elasticsearch</w:t>
-      </w:r>
-    </w:p>
-    <w:p>
-      <w:r>
-        <w:rPr>
-          <w:rFonts w:ascii="Consolas" w:eastAsia="Consolas" w:hAnsi="Consolas" w:cs="Consolas"/>
-          <w:sz w:val="18"/>
-          <w:szCs w:val="18"/>
-        </w:rPr>
-        <w:t xml:space="preserve">    restart: unless-stopped</w:t>
-      </w:r>
-    </w:p>
-    <w:p>
-      <w:r>
-        <w:rPr>
-          <w:rFonts w:ascii="Consolas" w:eastAsia="Consolas" w:hAnsi="Consolas" w:cs="Consolas"/>
-          <w:sz w:val="18"/>
-          <w:szCs w:val="18"/>
-        </w:rPr>
-        <w:t xml:space="preserve"> </w:t>
-      </w:r>
-    </w:p>
-    <w:p>
-      <w:r>
-        <w:rPr>
-          <w:rFonts w:ascii="Consolas" w:eastAsia="Consolas" w:hAnsi="Consolas" w:cs="Consolas"/>
-          <w:sz w:val="18"/>
-          <w:szCs w:val="18"/>
-        </w:rPr>
-        <w:t>networks:</w:t>
-      </w:r>
-    </w:p>
-    <w:p>
-      <w:r>
-        <w:rPr>
-          <w:rFonts w:ascii="Consolas" w:eastAsia="Consolas" w:hAnsi="Consolas" w:cs="Consolas"/>
-          <w:sz w:val="18"/>
-          <w:szCs w:val="18"/>
-        </w:rPr>
-        <w:t xml:space="preserve">  siem-net:</w:t>
-      </w:r>
-    </w:p>
-    <w:p>
-      <w:r>
-        <w:rPr>
-          <w:rFonts w:ascii="Consolas" w:eastAsia="Consolas" w:hAnsi="Consolas" w:cs="Consolas"/>
-          <w:sz w:val="18"/>
-          <w:szCs w:val="18"/>
-        </w:rPr>
-        <w:t xml:space="preserve">    driver: bridge</w:t>
-      </w:r>
-    </w:p>
-    <w:p>
-      <w:r>
-        <w:rPr>
-          <w:rFonts w:ascii="Consolas" w:eastAsia="Consolas" w:hAnsi="Consolas" w:cs="Consolas"/>
-          <w:sz w:val="18"/>
-          <w:szCs w:val="18"/>
-        </w:rPr>
-        <w:t xml:space="preserve"> </w:t>
-      </w:r>
-    </w:p>
-    <w:p>
-      <w:r>
-        <w:rPr>
-          <w:rFonts w:ascii="Consolas" w:eastAsia="Consolas" w:hAnsi="Consolas" w:cs="Consolas"/>
-          <w:sz w:val="18"/>
-          <w:szCs w:val="18"/>
-        </w:rPr>
-        <w:t>volumes:</w:t>
-      </w:r>
-    </w:p>
-    <w:p>
-      <w:r>
-        <w:rPr>
-          <w:rFonts w:ascii="Consolas" w:eastAsia="Consolas" w:hAnsi="Consolas" w:cs="Consolas"/>
-          <w:sz w:val="18"/>
-          <w:szCs w:val="18"/>
-        </w:rPr>
-        <w:t xml:space="preserve">  postgres_data:</w:t>
-      </w:r>
-    </w:p>
-    <w:p>
-      <w:r>
-        <w:rPr>
-          <w:rFonts w:ascii="Consolas" w:eastAsia="Consolas" w:hAnsi="Consolas" w:cs="Consolas"/>
-          <w:sz w:val="18"/>
-          <w:szCs w:val="18"/>
-        </w:rPr>
-        <w:t xml:space="preserve">  elasticsearch_data:</w:t>
-      </w:r>
-    </w:p>
-    <w:p>
-      <w:r>
-        <w:rPr>
-          <w:rFonts w:ascii="Consolas" w:eastAsia="Consolas" w:hAnsi="Consolas" w:cs="Consolas"/>
-          <w:sz w:val="18"/>
-          <w:szCs w:val="18"/>
-        </w:rPr>
-        <w:t xml:space="preserve">  n8n_data:</w:t>
-      </w:r>
-    </w:p>
-    <w:p>
-      <w:r>
-        <w:rPr>
-          <w:rFonts w:ascii="Consolas" w:eastAsia="Consolas" w:hAnsi="Consolas" w:cs="Consolas"/>
-          <w:sz w:val="18"/>
-          <w:szCs w:val="18"/>
-        </w:rPr>
-        <w:t xml:space="preserve">  grafana_data:</w:t>
-      </w:r>
-    </w:p>
-    <w:p>
-      <w:pPr>
-        <w:pStyle w:val="Ttulo2"/>
-      </w:pPr>
-      <w:bookmarkStart w:id="95" w:name="H0000049D"/>
-      <w:r>
-        <w:t>Anexo G — Configuración syslog-ng (syslog-ng/syslog-ng.conf)</w:t>
-      </w:r>
-      <w:bookmarkEnd w:id="95"/>
-    </w:p>
-    <w:p>
-      <w:r>
-        <w:t>Configuración del recolector de logs: escucha en UDP/514 y reenvía todo el tráfico recibido a Logstash en UDP/5140, sin aplicar transformaciones.</w:t>
-      </w:r>
-    </w:p>
-    <w:p>
-      <w:r>
-        <w:rPr>
-          <w:rFonts w:ascii="Consolas" w:eastAsia="Consolas" w:hAnsi="Consolas" w:cs="Consolas"/>
-          <w:sz w:val="18"/>
-          <w:szCs w:val="18"/>
-        </w:rPr>
-        <w:t>@version: 4.8</w:t>
-      </w:r>
-    </w:p>
-    <w:p>
-      <w:r>
-        <w:rPr>
-          <w:rFonts w:ascii="Consolas" w:eastAsia="Consolas" w:hAnsi="Consolas" w:cs="Consolas"/>
-          <w:sz w:val="18"/>
-          <w:szCs w:val="18"/>
-        </w:rPr>
-        <w:t>@include "scl.conf"</w:t>
-      </w:r>
-    </w:p>
-    <w:p>
-      <w:r>
-        <w:rPr>
-          <w:rFonts w:ascii="Consolas" w:eastAsia="Consolas" w:hAnsi="Consolas" w:cs="Consolas"/>
-          <w:sz w:val="18"/>
-          <w:szCs w:val="18"/>
-        </w:rPr>
-        <w:t xml:space="preserve"> </w:t>
-      </w:r>
-    </w:p>
-    <w:p>
-      <w:r>
-        <w:rPr>
-          <w:rFonts w:ascii="Consolas" w:eastAsia="Consolas" w:hAnsi="Consolas" w:cs="Consolas"/>
-          <w:sz w:val="18"/>
-          <w:szCs w:val="18"/>
-        </w:rPr>
-        <w:t>source s_network {</w:t>
-      </w:r>
-    </w:p>
-    <w:p>
-      <w:r>
-        <w:rPr>
-          <w:rFonts w:ascii="Consolas" w:eastAsia="Consolas" w:hAnsi="Consolas" w:cs="Consolas"/>
-          <w:sz w:val="18"/>
-          <w:szCs w:val="18"/>
-        </w:rPr>
-        <w:t xml:space="preserve">  network(</w:t>
-      </w:r>
-    </w:p>
-    <w:p>
-      <w:r>
-        <w:rPr>
-          <w:rFonts w:ascii="Consolas" w:eastAsia="Consolas" w:hAnsi="Consolas" w:cs="Consolas"/>
-          <w:sz w:val="18"/>
-          <w:szCs w:val="18"/>
-        </w:rPr>
-        <w:t xml:space="preserve">    transport("udp")</w:t>
-      </w:r>
-    </w:p>
-    <w:p>
-      <w:r>
-        <w:rPr>
-          <w:rFonts w:ascii="Consolas" w:eastAsia="Consolas" w:hAnsi="Consolas" w:cs="Consolas"/>
-          <w:sz w:val="18"/>
-          <w:szCs w:val="18"/>
-        </w:rPr>
-        <w:t xml:space="preserve">    port(514)</w:t>
-      </w:r>
-    </w:p>
-    <w:p>
-      <w:pPr>
-        <w:rPr>
-          <w:u w:val="single"/>
-        </w:rPr>
-      </w:pPr>
-      <w:r>
-        <w:rPr>
-          <w:rFonts w:ascii="Consolas" w:eastAsia="Consolas" w:hAnsi="Consolas" w:cs="Consolas"/>
-          <w:sz w:val="18"/>
-          <w:szCs w:val="18"/>
-        </w:rPr>
-        <w:t xml:space="preserve">  );</w:t>
-      </w:r>
-    </w:p>
-    <w:p>
-      <w:r>
-        <w:rPr>
-          <w:rFonts w:ascii="Consolas" w:eastAsia="Consolas" w:hAnsi="Consolas" w:cs="Consolas"/>
-          <w:sz w:val="18"/>
-          <w:szCs w:val="18"/>
-        </w:rPr>
-        <w:t>};</w:t>
-      </w:r>
-    </w:p>
-    <w:p>
-      <w:r>
-        <w:rPr>
-          <w:rFonts w:ascii="Consolas" w:eastAsia="Consolas" w:hAnsi="Consolas" w:cs="Consolas"/>
-          <w:sz w:val="18"/>
-          <w:szCs w:val="18"/>
-        </w:rPr>
-        <w:t xml:space="preserve"> </w:t>
-      </w:r>
-    </w:p>
-    <w:p>
-      <w:r>
-        <w:rPr>
-          <w:rFonts w:ascii="Consolas" w:eastAsia="Consolas" w:hAnsi="Consolas" w:cs="Consolas"/>
-          <w:sz w:val="18"/>
-          <w:szCs w:val="18"/>
-        </w:rPr>
-        <w:lastRenderedPageBreak/>
         <w:t>destination d_logstash {</w:t>
       </w:r>
     </w:p>
@@ -23970,6 +24041,7 @@
           </w:tcPr>
           <w:p>
             <w:r>
+              <w:lastRenderedPageBreak/>
               <w:t>Email Alerta</w:t>
             </w:r>
           </w:p>
@@ -24066,7 +24138,6 @@
           </w:tcPr>
           <w:p>
             <w:r>
-              <w:lastRenderedPageBreak/>
               <w:t>Crear Incidente Spraying / Alerta Spraying</w:t>
             </w:r>
           </w:p>
@@ -24479,7 +24550,11 @@
     </w:tbl>
     <w:p>
       <w:r>
-        <w:t>Además del workflow principal, el sistema incluye "SIEM – Reporte Diario" (Schedule Trigger que consulta las vistas de PostgreSQL y envía un resumen periódico por Telegram y email) y "SIEM – Error Handler" (Error Trigger que captura fallos de ejecución del propio n8n, notifica por Telegram y los registra en PostgreSQL).</w:t>
+        <w:t xml:space="preserve">Además del workflow principal, el sistema incluye "SIEM – Reporte Diario" (Schedule Trigger que consulta las vistas de PostgreSQL y envía un resumen periódico por Telegram y </w:t>
+      </w:r>
+      <w:r>
+        <w:lastRenderedPageBreak/>
+        <w:t>email) y "SIEM – Error Handler" (Error Trigger que captura fallos de ejecución del propio n8n, notifica por Telegram y los registra en PostgreSQL).</w:t>
       </w:r>
     </w:p>
     <w:p>
@@ -24549,7 +24624,6 @@
           <w:sz w:val="18"/>
           <w:szCs w:val="18"/>
         </w:rPr>
-        <w:lastRenderedPageBreak/>
         <w:t xml:space="preserve">  "severity": "high",</w:t>
       </w:r>
     </w:p>
@@ -24985,6 +25059,7 @@
           <w:sz w:val="18"/>
           <w:szCs w:val="18"/>
         </w:rPr>
+        <w:lastRenderedPageBreak/>
         <w:t xml:space="preserve">    editable: true</w:t>
       </w:r>
     </w:p>
@@ -25100,7 +25175,6 @@
     </w:p>
     <w:p>
       <w:r>
-        <w:lastRenderedPageBreak/>
         <w:t>J.2 Consultas SQL de ejemplo (panel SIEM Dashboard – Centro de Operaciones de Seguridad)</w:t>
       </w:r>
     </w:p>

</xml_diff>